<commit_message>
Update báo cáo chương 2
- Định hình cấu trúc thư mục cho chương 2
- Định dạng cỡ chữ của toàn bộ báo cáo
</commit_message>
<xml_diff>
--- a/Đề cương BTL_2026.docx
+++ b/Đề cương BTL_2026.docx
@@ -942,7 +942,9 @@
                 </w:tcPr>
                 <w:p>
                   <w:pPr>
+                    <w:framePr w:hSpace="181" w:wrap="around" w:vAnchor="page" w:hAnchor="margin" w:xAlign="center" w:y="1056"/>
                     <w:spacing w:line="360" w:lineRule="auto"/>
+                    <w:suppressOverlap/>
                     <w:rPr>
                       <w:rFonts w:ascii="Times New Roman" w:hAnsi="Times New Roman"/>
                       <w:b/>
@@ -1448,7 +1450,6 @@
               </w:rPr>
               <w:t xml:space="preserve"> </w:t>
             </w:r>
-            <w:proofErr w:type="spellStart"/>
             <w:r>
               <w:rPr>
                 <w:rFonts w:ascii="Times New Roman" w:hAnsi="Times New Roman"/>
@@ -1456,17 +1457,7 @@
                 <w:sz w:val="28"/>
                 <w:szCs w:val="28"/>
               </w:rPr>
-              <w:t>ThS</w:t>
-            </w:r>
-            <w:proofErr w:type="spellEnd"/>
-            <w:r>
-              <w:rPr>
-                <w:rFonts w:ascii="Times New Roman" w:hAnsi="Times New Roman"/>
-                <w:b/>
-                <w:sz w:val="28"/>
-                <w:szCs w:val="28"/>
-              </w:rPr>
-              <w:t xml:space="preserve">. </w:t>
+              <w:t xml:space="preserve">ThS. </w:t>
             </w:r>
             <w:r>
               <w:rPr>
@@ -3357,6 +3348,7 @@
           <w:szCs w:val="26"/>
           <w:lang w:val="vi-VN"/>
         </w:rPr>
+        <w:lastRenderedPageBreak/>
         <w:t xml:space="preserve">Nghiên cứu </w:t>
       </w:r>
       <w:proofErr w:type="spellStart"/>
@@ -3474,7 +3466,6 @@
           <w:szCs w:val="26"/>
           <w:lang w:val="vi-VN"/>
         </w:rPr>
-        <w:lastRenderedPageBreak/>
         <w:t xml:space="preserve">Nghiên cứu </w:t>
       </w:r>
       <w:proofErr w:type="spellStart"/>
@@ -4032,6 +4023,7 @@
           <w:szCs w:val="26"/>
           <w:lang w:val="vi-VN"/>
         </w:rPr>
+        <w:lastRenderedPageBreak/>
         <w:t>Kỹ thuật viên: có thể xem các yêu cầu được phân công, tiếp nhận yêu cầu, nhận xử lý, cập nhật tiến độ, yêu cầu bổ sung thông tin, hoàn thành yêu cầu và xem lịch sử xử lý.</w:t>
       </w:r>
     </w:p>
@@ -4053,7 +4045,6 @@
           <w:szCs w:val="26"/>
           <w:lang w:val="vi-VN"/>
         </w:rPr>
-        <w:lastRenderedPageBreak/>
         <w:t>Quản trị viên: quản lý tài khoản, vai trò, danh mục sự cố, phòng học/phòng làm việc, thiết bị, cấu hình SLA, yêu cầu hỗ trợ, thông báo, đánh giá và các thông tin thống kê của hệ thống.</w:t>
       </w:r>
     </w:p>
@@ -4421,6 +4412,7 @@
           <w:szCs w:val="26"/>
           <w:lang w:val="vi-VN"/>
         </w:rPr>
+        <w:lastRenderedPageBreak/>
         <w:t>Cập nhật tiến độ xử lý.</w:t>
       </w:r>
     </w:p>
@@ -4463,7 +4455,6 @@
           <w:szCs w:val="26"/>
           <w:lang w:val="vi-VN"/>
         </w:rPr>
-        <w:lastRenderedPageBreak/>
         <w:t>Tiếp tục xử lý sau khi người dùng bổ sung thông tin.</w:t>
       </w:r>
     </w:p>
@@ -4760,7 +4751,15 @@
           <w:szCs w:val="26"/>
           <w:lang w:val="vi-VN"/>
         </w:rPr>
-        <w:t>Đối với quản trị viên, đề tài cung cấp một giải pháp quản lý tổng thể các hoạt động hỗ trợ kỹ thuật trong trường. Quản trị viên có thể quản lý tài khoản, vai trò, danh mục sự cố, phòng, thiết bị, cấu hình SLA và theo dõi các yêu cầu hỗ trợ. Hệ thống đồng thời cung cấp các thông tin thống kê nhằm hỗ trợ quản trị viên đánh giá tình hình hoạt động và đưa ra các quyết định phù hợp.</w:t>
+        <w:t xml:space="preserve">Đối với quản trị viên, đề tài cung cấp một giải pháp quản lý tổng thể các hoạt động hỗ trợ kỹ thuật trong trường. Quản trị viên có thể quản lý tài khoản, vai trò, </w:t>
+      </w:r>
+      <w:r>
+        <w:rPr>
+          <w:szCs w:val="26"/>
+          <w:lang w:val="vi-VN"/>
+        </w:rPr>
+        <w:lastRenderedPageBreak/>
+        <w:t>danh mục sự cố, phòng, thiết bị, cấu hình SLA và theo dõi các yêu cầu hỗ trợ. Hệ thống đồng thời cung cấp các thông tin thống kê nhằm hỗ trợ quản trị viên đánh giá tình hình hoạt động và đưa ra các quyết định phù hợp.</w:t>
       </w:r>
     </w:p>
     <w:p>
@@ -4778,7 +4777,6 @@
           <w:szCs w:val="26"/>
           <w:lang w:val="vi-VN"/>
         </w:rPr>
-        <w:lastRenderedPageBreak/>
         <w:t>Việc tập trung dữ liệu trên một hệ thống duy nhất giúp hạn chế tình trạng thất lạc thông tin, giảm phụ thuộc vào phương thức trao đổi thủ công và tăng tính minh bạch trong quá trình xử lý yêu cầu. Người dùng có thể biết được yêu cầu của mình đang ở trạng thái nào, yêu cầu đã được tiếp nhận hay chưa và quá trình xử lý đang được thực hiện bởi bộ phận nào.</w:t>
       </w:r>
     </w:p>
@@ -5358,7 +5356,15 @@
           <w:szCs w:val="26"/>
           <w:lang w:val="vi-VN"/>
         </w:rPr>
-        <w:t xml:space="preserve"> và DTO. Cách tổ chức này giúp phân tách trách nhiệm giữa các thành phần, tăng khả năng bảo trì, kiểm thử và mở rộng hệ thống.</w:t>
+        <w:t xml:space="preserve"> và DTO. Cách tổ chức này giúp phân </w:t>
+      </w:r>
+      <w:r>
+        <w:rPr>
+          <w:szCs w:val="26"/>
+          <w:lang w:val="vi-VN"/>
+        </w:rPr>
+        <w:lastRenderedPageBreak/>
+        <w:t>tách trách nhiệm giữa các thành phần, tăng khả năng bảo trì, kiểm thử và mở rộng hệ thống.</w:t>
       </w:r>
     </w:p>
     <w:p>
@@ -5379,15 +5385,7 @@
           <w:szCs w:val="26"/>
           <w:lang w:val="vi-VN"/>
         </w:rPr>
-        <w:t xml:space="preserve">Ứng dụng cơ chế quản lý trạng thái yêu cầu: Hệ thống xây dựng quy trình chuyển trạng thái yêu cầu theo nghiệp vụ, hạn chế việc chuyển trạng thái </w:t>
-      </w:r>
-      <w:r>
-        <w:rPr>
-          <w:szCs w:val="26"/>
-          <w:lang w:val="vi-VN"/>
-        </w:rPr>
-        <w:lastRenderedPageBreak/>
-        <w:t>không hợp lệ. Điều này giúp đảm bảo tính nhất quán của dữ liệu và phản ánh chính xác tiến trình xử lý sự cố.</w:t>
+        <w:t>Ứng dụng cơ chế quản lý trạng thái yêu cầu: Hệ thống xây dựng quy trình chuyển trạng thái yêu cầu theo nghiệp vụ, hạn chế việc chuyển trạng thái không hợp lệ. Điều này giúp đảm bảo tính nhất quán của dữ liệu và phản ánh chính xác tiến trình xử lý sự cố.</w:t>
       </w:r>
     </w:p>
     <w:p>
@@ -5794,7 +5792,15 @@
           <w:szCs w:val="26"/>
           <w:lang w:val="vi-VN"/>
         </w:rPr>
-        <w:t xml:space="preserve"> và các công cụ hỗ trợ phát triển hệ thống. Bên cạnh đó, chương trình bày các kiến thức liên quan đến kiến trúc ứng dụng </w:t>
+        <w:t xml:space="preserve"> và các công cụ hỗ trợ phát triển hệ thống. Bên cạnh đó, chương trình bày các kiến thức liên </w:t>
+      </w:r>
+      <w:r>
+        <w:rPr>
+          <w:szCs w:val="26"/>
+          <w:lang w:val="vi-VN"/>
+        </w:rPr>
+        <w:lastRenderedPageBreak/>
+        <w:t xml:space="preserve">quan đến kiến trúc ứng dụng </w:t>
       </w:r>
       <w:proofErr w:type="spellStart"/>
       <w:r>
@@ -5831,15 +5837,7 @@
           <w:szCs w:val="26"/>
           <w:lang w:val="vi-VN"/>
         </w:rPr>
-        <w:t xml:space="preserve">Chương 3: Phân tích và thiết kế hệ thống. Chương này tập trung vào quá trình khảo sát, thu thập và phân tích yêu cầu hệ thống dành cho ba nhóm đối tượng: </w:t>
-      </w:r>
-      <w:r>
-        <w:rPr>
-          <w:szCs w:val="26"/>
-          <w:lang w:val="vi-VN"/>
-        </w:rPr>
-        <w:lastRenderedPageBreak/>
-        <w:t xml:space="preserve">Sinh viên, Kỹ thuật viên và Quản trị viên. Dựa trên các yêu cầu đó, chương trình bày chi tiết các bước thiết kế hệ thống thông qua hệ thống biểu đồ UML như </w:t>
+        <w:t xml:space="preserve">Chương 3: Phân tích và thiết kế hệ thống. Chương này tập trung vào quá trình khảo sát, thu thập và phân tích yêu cầu hệ thống dành cho ba nhóm đối tượng: Sinh viên, Kỹ thuật viên và Quản trị viên. Dựa trên các yêu cầu đó, chương trình bày chi tiết các bước thiết kế hệ thống thông qua hệ thống biểu đồ UML như </w:t>
       </w:r>
       <w:proofErr w:type="spellStart"/>
       <w:r>
@@ -14843,11 +14841,9 @@
     <w:p>
       <w:pPr>
         <w:spacing w:before="120" w:after="120" w:line="360" w:lineRule="auto"/>
-        <w:jc w:val="both"/>
         <w:rPr>
           <w:rFonts w:ascii="Times New Roman" w:hAnsi="Times New Roman"/>
           <w:b/>
-          <w:bCs/>
           <w:sz w:val="28"/>
           <w:szCs w:val="28"/>
           <w:lang w:val="vi-VN"/>
@@ -14861,237 +14857,1135 @@
           <w:szCs w:val="28"/>
           <w:lang w:val="vi-VN"/>
         </w:rPr>
-        <w:t>Chương 2</w:t>
-      </w:r>
-      <w:r>
-        <w:rPr>
-          <w:rFonts w:ascii="Times New Roman" w:hAnsi="Times New Roman"/>
+        <w:br w:type="page"/>
+      </w:r>
+    </w:p>
+    <w:p>
+      <w:pPr>
+        <w:pStyle w:val="u1"/>
+        <w:spacing w:line="360" w:lineRule="auto"/>
+        <w:jc w:val="center"/>
+        <w:rPr>
+          <w:rFonts w:ascii="Times New Roman" w:hAnsi="Times New Roman"/>
+          <w:bCs w:val="0"/>
+          <w:sz w:val="28"/>
+          <w:szCs w:val="28"/>
+          <w:lang w:val="vi-VN"/>
+        </w:rPr>
+      </w:pPr>
+      <w:r>
+        <w:rPr>
+          <w:rFonts w:ascii="Times New Roman" w:hAnsi="Times New Roman"/>
+          <w:bCs w:val="0"/>
+          <w:sz w:val="28"/>
+          <w:szCs w:val="28"/>
+          <w:lang w:val="vi-VN"/>
+        </w:rPr>
+        <w:lastRenderedPageBreak/>
+        <w:t xml:space="preserve">CHƯƠNG 2. </w:t>
+      </w:r>
+      <w:r>
+        <w:rPr>
+          <w:rFonts w:ascii="Times New Roman" w:hAnsi="Times New Roman"/>
+          <w:bCs w:val="0"/>
+          <w:sz w:val="28"/>
+          <w:szCs w:val="28"/>
+          <w:lang w:val="vi-VN"/>
+        </w:rPr>
+        <w:t>PHÂN TÍCH VÀ THIẾT KẾ HỆ THỐNG</w:t>
+      </w:r>
+    </w:p>
+    <w:p>
+      <w:pPr>
+        <w:pStyle w:val="u2"/>
+        <w:spacing w:line="360" w:lineRule="auto"/>
+        <w:rPr>
+          <w:rFonts w:ascii="Times New Roman" w:eastAsia="Times New Roman" w:hAnsi="Times New Roman" w:cs="Times New Roman"/>
+          <w:lang w:val="vi-VN"/>
+        </w:rPr>
+      </w:pPr>
+      <w:hyperlink w:anchor="_Toc242195404" w:history="1">
+        <w:r>
+          <w:rPr>
+            <w:rStyle w:val="Siuktni"/>
+            <w:rFonts w:ascii="Times New Roman" w:hAnsi="Times New Roman"/>
+            <w:iCs/>
+            <w:color w:val="auto"/>
+            <w:u w:val="none"/>
+            <w:lang w:val="vi-VN"/>
+          </w:rPr>
+          <w:t>2</w:t>
+        </w:r>
+        <w:r>
+          <w:rPr>
+            <w:rStyle w:val="Siuktni"/>
+            <w:rFonts w:ascii="Times New Roman" w:hAnsi="Times New Roman" w:cs="Times New Roman"/>
+            <w:iCs/>
+            <w:color w:val="auto"/>
+            <w:u w:val="none"/>
+            <w:lang w:val="vi-VN"/>
+          </w:rPr>
+          <w:t>.1. Khảo sát và phân tích yêu cầu hệ thống</w:t>
+        </w:r>
+      </w:hyperlink>
+    </w:p>
+    <w:p>
+      <w:pPr>
+        <w:pStyle w:val="u3"/>
+        <w:spacing w:line="360" w:lineRule="auto"/>
+        <w:rPr>
+          <w:rFonts w:ascii="Times New Roman" w:eastAsiaTheme="minorEastAsia" w:hAnsi="Times New Roman" w:cs="Times New Roman"/>
           <w:b/>
-          <w:sz w:val="28"/>
-          <w:szCs w:val="28"/>
-          <w:lang w:val="vi-VN"/>
-        </w:rPr>
-        <w:t>.</w:t>
-      </w:r>
-      <w:r>
-        <w:rPr>
-          <w:rFonts w:ascii="Times New Roman" w:hAnsi="Times New Roman"/>
+          <w:kern w:val="2"/>
+          <w:lang w:val="vi-VN" w:eastAsia="vi-VN"/>
+          <w14:ligatures w14:val="standardContextual"/>
+        </w:rPr>
+      </w:pPr>
+      <w:hyperlink w:anchor="_Toc242195405" w:history="1">
+        <w:r>
+          <w:rPr>
+            <w:rStyle w:val="Siuktni"/>
+            <w:rFonts w:ascii="Times New Roman" w:hAnsi="Times New Roman"/>
+            <w:iCs/>
+            <w:color w:val="auto"/>
+            <w:szCs w:val="26"/>
+            <w:u w:val="none"/>
+            <w:lang w:val="vi-VN"/>
+          </w:rPr>
+          <w:t>2</w:t>
+        </w:r>
+        <w:r>
+          <w:rPr>
+            <w:rStyle w:val="Siuktni"/>
+            <w:rFonts w:ascii="Times New Roman" w:hAnsi="Times New Roman" w:cs="Times New Roman"/>
+            <w:iCs/>
+            <w:color w:val="auto"/>
+            <w:sz w:val="26"/>
+            <w:szCs w:val="26"/>
+            <w:u w:val="none"/>
+            <w:lang w:val="vi-VN"/>
+          </w:rPr>
+          <w:t>.1.1 Cơ sở lý thuyết và vai trò thu thập yêu cầu</w:t>
+        </w:r>
+      </w:hyperlink>
+    </w:p>
+    <w:p>
+      <w:pPr>
+        <w:pStyle w:val="u3"/>
+        <w:spacing w:line="360" w:lineRule="auto"/>
+        <w:rPr>
+          <w:rFonts w:ascii="Times New Roman" w:eastAsiaTheme="minorEastAsia" w:hAnsi="Times New Roman" w:cs="Times New Roman"/>
           <w:b/>
-          <w:sz w:val="28"/>
-          <w:szCs w:val="28"/>
-          <w:lang w:val="vi-VN"/>
-        </w:rPr>
-        <w:t xml:space="preserve"> </w:t>
-      </w:r>
-      <w:r>
-        <w:rPr>
-          <w:rFonts w:ascii="Times New Roman" w:hAnsi="Times New Roman"/>
+          <w:kern w:val="2"/>
+          <w:lang w:val="vi-VN" w:eastAsia="vi-VN"/>
+          <w14:ligatures w14:val="standardContextual"/>
+        </w:rPr>
+      </w:pPr>
+      <w:hyperlink w:anchor="_Toc242195406" w:history="1">
+        <w:r>
+          <w:rPr>
+            <w:rStyle w:val="Siuktni"/>
+            <w:rFonts w:ascii="Times New Roman" w:hAnsi="Times New Roman"/>
+            <w:iCs/>
+            <w:color w:val="auto"/>
+            <w:szCs w:val="26"/>
+            <w:u w:val="none"/>
+            <w:lang w:val="vi-VN"/>
+          </w:rPr>
+          <w:t>2</w:t>
+        </w:r>
+        <w:r>
+          <w:rPr>
+            <w:rStyle w:val="Siuktni"/>
+            <w:rFonts w:ascii="Times New Roman" w:hAnsi="Times New Roman" w:cs="Times New Roman"/>
+            <w:iCs/>
+            <w:color w:val="auto"/>
+            <w:sz w:val="26"/>
+            <w:szCs w:val="26"/>
+            <w:u w:val="none"/>
+            <w:lang w:val="vi-VN"/>
+          </w:rPr>
+          <w:t>.1.2 Phương pháp thu thập yêu cầu và kết quả khảo sát thực tế</w:t>
+        </w:r>
+      </w:hyperlink>
+    </w:p>
+    <w:p>
+      <w:pPr>
+        <w:pStyle w:val="u3"/>
+        <w:spacing w:line="360" w:lineRule="auto"/>
+        <w:rPr>
+          <w:rFonts w:ascii="Times New Roman" w:eastAsiaTheme="minorEastAsia" w:hAnsi="Times New Roman" w:cs="Times New Roman"/>
           <w:b/>
-          <w:bCs/>
-          <w:sz w:val="28"/>
-          <w:szCs w:val="28"/>
-          <w:lang w:val="vi-VN"/>
-        </w:rPr>
-        <w:t>PHÂN TÍCH VÀ THIẾT KẾ HỆ THỐNG</w:t>
-      </w:r>
-    </w:p>
-    <w:p>
-      <w:pPr>
-        <w:spacing w:before="120" w:after="120" w:line="360" w:lineRule="auto"/>
-        <w:ind w:firstLine="567"/>
-        <w:jc w:val="both"/>
-        <w:rPr>
-          <w:rFonts w:ascii="Times New Roman" w:hAnsi="Times New Roman"/>
-          <w:sz w:val="28"/>
-          <w:szCs w:val="28"/>
-          <w:lang w:val="vi-VN"/>
-        </w:rPr>
-      </w:pPr>
-      <w:r>
-        <w:rPr>
-          <w:rFonts w:ascii="Times New Roman" w:hAnsi="Times New Roman"/>
-          <w:sz w:val="28"/>
-          <w:szCs w:val="28"/>
-          <w:lang w:val="vi-VN"/>
-        </w:rPr>
-        <w:t xml:space="preserve">tập trung vào các sơ đồ phân tích, </w:t>
-      </w:r>
-    </w:p>
-    <w:p>
-      <w:pPr>
-        <w:spacing w:before="120" w:after="120" w:line="360" w:lineRule="auto"/>
-        <w:ind w:firstLine="567"/>
-        <w:jc w:val="both"/>
-        <w:rPr>
-          <w:rFonts w:ascii="Times New Roman" w:hAnsi="Times New Roman"/>
-          <w:sz w:val="28"/>
-          <w:szCs w:val="28"/>
-          <w:lang w:val="vi-VN"/>
-        </w:rPr>
-      </w:pPr>
-      <w:r>
-        <w:rPr>
-          <w:rFonts w:ascii="Times New Roman" w:hAnsi="Times New Roman"/>
-          <w:sz w:val="28"/>
-          <w:szCs w:val="28"/>
-          <w:lang w:val="vi-VN"/>
-        </w:rPr>
-        <w:t xml:space="preserve">thiết kế, </w:t>
-      </w:r>
-    </w:p>
-    <w:p>
-      <w:pPr>
-        <w:spacing w:before="120" w:after="120" w:line="360" w:lineRule="auto"/>
-        <w:ind w:firstLine="567"/>
-        <w:jc w:val="both"/>
-        <w:rPr>
-          <w:rFonts w:ascii="Times New Roman" w:hAnsi="Times New Roman"/>
-          <w:sz w:val="28"/>
-          <w:szCs w:val="28"/>
-          <w:lang w:val="vi-VN"/>
-        </w:rPr>
-      </w:pPr>
-      <w:r>
-        <w:rPr>
-          <w:rFonts w:ascii="Times New Roman" w:hAnsi="Times New Roman"/>
-          <w:sz w:val="28"/>
-          <w:szCs w:val="28"/>
-          <w:lang w:val="vi-VN"/>
-        </w:rPr>
-        <w:t xml:space="preserve">đặc biệt là </w:t>
-      </w:r>
-      <w:proofErr w:type="spellStart"/>
-      <w:r>
-        <w:rPr>
-          <w:rFonts w:ascii="Times New Roman" w:hAnsi="Times New Roman"/>
-          <w:sz w:val="28"/>
-          <w:szCs w:val="28"/>
-          <w:lang w:val="vi-VN"/>
-        </w:rPr>
-        <w:t>Use</w:t>
-      </w:r>
-      <w:proofErr w:type="spellEnd"/>
-      <w:r>
-        <w:rPr>
-          <w:rFonts w:ascii="Times New Roman" w:hAnsi="Times New Roman"/>
-          <w:sz w:val="28"/>
-          <w:szCs w:val="28"/>
-          <w:lang w:val="vi-VN"/>
-        </w:rPr>
-        <w:t xml:space="preserve"> </w:t>
-      </w:r>
-      <w:proofErr w:type="spellStart"/>
-      <w:r>
-        <w:rPr>
-          <w:rFonts w:ascii="Times New Roman" w:hAnsi="Times New Roman"/>
-          <w:sz w:val="28"/>
-          <w:szCs w:val="28"/>
-          <w:lang w:val="vi-VN"/>
-        </w:rPr>
-        <w:t>Case</w:t>
-      </w:r>
-      <w:proofErr w:type="spellEnd"/>
-      <w:r>
-        <w:rPr>
-          <w:rFonts w:ascii="Times New Roman" w:hAnsi="Times New Roman"/>
-          <w:sz w:val="28"/>
-          <w:szCs w:val="28"/>
-          <w:lang w:val="vi-VN"/>
-        </w:rPr>
-        <w:t xml:space="preserve">, </w:t>
-      </w:r>
-    </w:p>
-    <w:p>
-      <w:pPr>
-        <w:spacing w:before="120" w:after="120" w:line="360" w:lineRule="auto"/>
-        <w:ind w:firstLine="567"/>
-        <w:jc w:val="both"/>
-        <w:rPr>
-          <w:rFonts w:ascii="Times New Roman" w:hAnsi="Times New Roman"/>
-          <w:sz w:val="28"/>
-          <w:szCs w:val="28"/>
-          <w:lang w:val="vi-VN"/>
-        </w:rPr>
-      </w:pPr>
-      <w:r>
-        <w:rPr>
-          <w:rFonts w:ascii="Times New Roman" w:hAnsi="Times New Roman"/>
-          <w:sz w:val="28"/>
-          <w:szCs w:val="28"/>
-          <w:lang w:val="vi-VN"/>
-        </w:rPr>
-        <w:t xml:space="preserve">ERD, </w:t>
-      </w:r>
-    </w:p>
-    <w:p>
-      <w:pPr>
-        <w:spacing w:before="120" w:after="120" w:line="360" w:lineRule="auto"/>
-        <w:ind w:firstLine="567"/>
-        <w:jc w:val="both"/>
-        <w:rPr>
-          <w:rFonts w:ascii="Times New Roman" w:hAnsi="Times New Roman"/>
-          <w:sz w:val="28"/>
-          <w:szCs w:val="28"/>
-          <w:lang w:val="vi-VN"/>
-        </w:rPr>
-      </w:pPr>
-      <w:r>
-        <w:rPr>
-          <w:rFonts w:ascii="Times New Roman" w:hAnsi="Times New Roman"/>
-          <w:sz w:val="28"/>
-          <w:szCs w:val="28"/>
-          <w:lang w:val="vi-VN"/>
-        </w:rPr>
-        <w:t xml:space="preserve">biểu đồ trạng thái yêu cầu </w:t>
-      </w:r>
-    </w:p>
-    <w:p>
-      <w:pPr>
-        <w:spacing w:before="120" w:after="120" w:line="360" w:lineRule="auto"/>
-        <w:ind w:firstLine="567"/>
-        <w:jc w:val="both"/>
-        <w:rPr>
-          <w:rFonts w:ascii="Times New Roman" w:hAnsi="Times New Roman"/>
-          <w:sz w:val="28"/>
-          <w:szCs w:val="28"/>
-          <w:lang w:val="vi-VN"/>
-        </w:rPr>
-      </w:pPr>
-      <w:r>
-        <w:rPr>
-          <w:rFonts w:ascii="Times New Roman" w:hAnsi="Times New Roman"/>
-          <w:sz w:val="28"/>
-          <w:szCs w:val="28"/>
-          <w:lang w:val="vi-VN"/>
-        </w:rPr>
-        <w:t>biểu đồ triển khai.</w:t>
-      </w:r>
-    </w:p>
-    <w:p>
-      <w:pPr>
-        <w:spacing w:before="120" w:after="120" w:line="360" w:lineRule="auto"/>
-        <w:ind w:firstLine="567"/>
-        <w:jc w:val="both"/>
-        <w:rPr>
-          <w:rFonts w:ascii="Times New Roman" w:hAnsi="Times New Roman"/>
-          <w:sz w:val="28"/>
-          <w:szCs w:val="28"/>
-          <w:lang w:val="vi-VN"/>
-        </w:rPr>
-      </w:pPr>
-      <w:r>
-        <w:rPr>
-          <w:rFonts w:ascii="Times New Roman" w:hAnsi="Times New Roman"/>
-          <w:sz w:val="28"/>
-          <w:szCs w:val="28"/>
-          <w:lang w:val="vi-VN"/>
-        </w:rPr>
-        <w:t>Kết luận chương</w:t>
-      </w:r>
-    </w:p>
-    <w:p>
-      <w:pPr>
-        <w:spacing w:before="120" w:after="120" w:line="360" w:lineRule="auto"/>
+          <w:kern w:val="2"/>
+          <w:lang w:val="vi-VN" w:eastAsia="vi-VN"/>
+          <w14:ligatures w14:val="standardContextual"/>
+        </w:rPr>
+      </w:pPr>
+      <w:hyperlink w:anchor="_Toc242195407" w:history="1">
+        <w:r>
+          <w:rPr>
+            <w:rStyle w:val="Siuktni"/>
+            <w:rFonts w:ascii="Times New Roman" w:hAnsi="Times New Roman"/>
+            <w:iCs/>
+            <w:color w:val="auto"/>
+            <w:szCs w:val="26"/>
+            <w:u w:val="none"/>
+            <w:lang w:val="vi-VN"/>
+          </w:rPr>
+          <w:t>2</w:t>
+        </w:r>
+        <w:r>
+          <w:rPr>
+            <w:rStyle w:val="Siuktni"/>
+            <w:rFonts w:ascii="Times New Roman" w:hAnsi="Times New Roman" w:cs="Times New Roman"/>
+            <w:iCs/>
+            <w:color w:val="auto"/>
+            <w:sz w:val="26"/>
+            <w:szCs w:val="26"/>
+            <w:u w:val="none"/>
+            <w:lang w:val="vi-VN"/>
+          </w:rPr>
+          <w:t>.1.</w:t>
+        </w:r>
+        <w:r>
+          <w:rPr>
+            <w:rStyle w:val="Siuktni"/>
+            <w:rFonts w:ascii="Times New Roman" w:hAnsi="Times New Roman"/>
+            <w:iCs/>
+            <w:color w:val="auto"/>
+            <w:szCs w:val="26"/>
+            <w:u w:val="none"/>
+            <w:lang w:val="vi-VN"/>
+          </w:rPr>
+          <w:t>3</w:t>
+        </w:r>
+        <w:r>
+          <w:rPr>
+            <w:rStyle w:val="Siuktni"/>
+            <w:rFonts w:ascii="Times New Roman" w:hAnsi="Times New Roman" w:cs="Times New Roman"/>
+            <w:iCs/>
+            <w:color w:val="auto"/>
+            <w:sz w:val="26"/>
+            <w:szCs w:val="26"/>
+            <w:u w:val="none"/>
+            <w:lang w:val="vi-VN"/>
+          </w:rPr>
+          <w:t xml:space="preserve"> Đánh giá và lựa chọn kiến trúc, công nghệ phù hợp</w:t>
+        </w:r>
+      </w:hyperlink>
+    </w:p>
+    <w:p>
+      <w:pPr>
+        <w:pStyle w:val="u2"/>
+        <w:spacing w:line="360" w:lineRule="auto"/>
+        <w:rPr>
+          <w:rFonts w:ascii="Times New Roman" w:eastAsiaTheme="minorEastAsia" w:hAnsi="Times New Roman" w:cs="Times New Roman"/>
+          <w:kern w:val="2"/>
+          <w:lang w:val="vi-VN" w:eastAsia="vi-VN"/>
+          <w14:ligatures w14:val="standardContextual"/>
+        </w:rPr>
+      </w:pPr>
+      <w:hyperlink w:anchor="_Toc242195408" w:history="1">
+        <w:r>
+          <w:rPr>
+            <w:rStyle w:val="Siuktni"/>
+            <w:rFonts w:ascii="Times New Roman" w:hAnsi="Times New Roman"/>
+            <w:iCs/>
+            <w:color w:val="auto"/>
+            <w:u w:val="none"/>
+            <w:lang w:val="vi-VN"/>
+          </w:rPr>
+          <w:t>2</w:t>
+        </w:r>
+        <w:r>
+          <w:rPr>
+            <w:rStyle w:val="Siuktni"/>
+            <w:rFonts w:ascii="Times New Roman" w:hAnsi="Times New Roman" w:cs="Times New Roman"/>
+            <w:iCs/>
+            <w:color w:val="auto"/>
+            <w:u w:val="none"/>
+            <w:lang w:val="vi-VN"/>
+          </w:rPr>
+          <w:t>.2. Phân tích hệ thống</w:t>
+        </w:r>
+      </w:hyperlink>
+    </w:p>
+    <w:p>
+      <w:pPr>
+        <w:pStyle w:val="u3"/>
+        <w:spacing w:line="360" w:lineRule="auto"/>
+        <w:rPr>
+          <w:rFonts w:ascii="Times New Roman" w:eastAsiaTheme="minorEastAsia" w:hAnsi="Times New Roman" w:cs="Times New Roman"/>
+          <w:b/>
+          <w:kern w:val="2"/>
+          <w:lang w:val="vi-VN" w:eastAsia="vi-VN"/>
+          <w14:ligatures w14:val="standardContextual"/>
+        </w:rPr>
+      </w:pPr>
+      <w:hyperlink w:anchor="_Toc242195409" w:history="1">
+        <w:r>
+          <w:rPr>
+            <w:rStyle w:val="Siuktni"/>
+            <w:rFonts w:ascii="Times New Roman" w:hAnsi="Times New Roman"/>
+            <w:iCs/>
+            <w:color w:val="auto"/>
+            <w:szCs w:val="26"/>
+            <w:u w:val="none"/>
+            <w:lang w:val="vi-VN"/>
+          </w:rPr>
+          <w:t>2</w:t>
+        </w:r>
+        <w:r>
+          <w:rPr>
+            <w:rStyle w:val="Siuktni"/>
+            <w:rFonts w:ascii="Times New Roman" w:hAnsi="Times New Roman" w:cs="Times New Roman"/>
+            <w:iCs/>
+            <w:color w:val="auto"/>
+            <w:sz w:val="26"/>
+            <w:szCs w:val="26"/>
+            <w:u w:val="none"/>
+            <w:lang w:val="vi-VN"/>
+          </w:rPr>
+          <w:t xml:space="preserve">.2.1 Yêu cầu chức năng cho người </w:t>
+        </w:r>
+        <w:r>
+          <w:rPr>
+            <w:rStyle w:val="Siuktni"/>
+            <w:rFonts w:ascii="Times New Roman" w:hAnsi="Times New Roman" w:cs="Times New Roman"/>
+            <w:iCs/>
+            <w:color w:val="auto"/>
+            <w:szCs w:val="26"/>
+            <w:u w:val="none"/>
+            <w:lang w:val="vi-VN"/>
+          </w:rPr>
+          <w:t>dùng</w:t>
+        </w:r>
+      </w:hyperlink>
+    </w:p>
+    <w:p>
+      <w:pPr>
+        <w:pStyle w:val="u3"/>
+        <w:spacing w:line="360" w:lineRule="auto"/>
+        <w:rPr>
+          <w:rFonts w:ascii="Times New Roman" w:eastAsiaTheme="minorEastAsia" w:hAnsi="Times New Roman" w:cs="Times New Roman"/>
+          <w:b/>
+          <w:kern w:val="2"/>
+          <w:lang w:val="vi-VN" w:eastAsia="vi-VN"/>
+          <w14:ligatures w14:val="standardContextual"/>
+        </w:rPr>
+      </w:pPr>
+      <w:hyperlink w:anchor="_Toc242195410" w:history="1">
+        <w:r>
+          <w:rPr>
+            <w:rStyle w:val="Siuktni"/>
+            <w:rFonts w:ascii="Times New Roman" w:hAnsi="Times New Roman"/>
+            <w:iCs/>
+            <w:color w:val="auto"/>
+            <w:szCs w:val="26"/>
+            <w:u w:val="none"/>
+            <w:lang w:val="vi-VN"/>
+          </w:rPr>
+          <w:t>2</w:t>
+        </w:r>
+        <w:r>
+          <w:rPr>
+            <w:rStyle w:val="Siuktni"/>
+            <w:rFonts w:ascii="Times New Roman" w:hAnsi="Times New Roman" w:cs="Times New Roman"/>
+            <w:iCs/>
+            <w:color w:val="auto"/>
+            <w:sz w:val="26"/>
+            <w:szCs w:val="26"/>
+            <w:u w:val="none"/>
+            <w:lang w:val="vi-VN"/>
+          </w:rPr>
+          <w:t>.2.2 Yêu cầu chức năng cho quản trị viên</w:t>
+        </w:r>
+      </w:hyperlink>
+    </w:p>
+    <w:p>
+      <w:pPr>
+        <w:pStyle w:val="u3"/>
+        <w:spacing w:line="360" w:lineRule="auto"/>
+        <w:rPr>
+          <w:rFonts w:ascii="Times New Roman" w:eastAsiaTheme="minorEastAsia" w:hAnsi="Times New Roman" w:cs="Times New Roman"/>
+          <w:b/>
+          <w:kern w:val="2"/>
+          <w:lang w:val="vi-VN" w:eastAsia="vi-VN"/>
+          <w14:ligatures w14:val="standardContextual"/>
+        </w:rPr>
+      </w:pPr>
+      <w:hyperlink w:anchor="_Toc242195411" w:history="1">
+        <w:r>
+          <w:rPr>
+            <w:rStyle w:val="Siuktni"/>
+            <w:rFonts w:ascii="Times New Roman" w:hAnsi="Times New Roman"/>
+            <w:iCs/>
+            <w:color w:val="auto"/>
+            <w:szCs w:val="26"/>
+            <w:u w:val="none"/>
+            <w:lang w:val="vi-VN"/>
+          </w:rPr>
+          <w:t>2</w:t>
+        </w:r>
+        <w:r>
+          <w:rPr>
+            <w:rStyle w:val="Siuktni"/>
+            <w:rFonts w:ascii="Times New Roman" w:hAnsi="Times New Roman" w:cs="Times New Roman"/>
+            <w:iCs/>
+            <w:color w:val="auto"/>
+            <w:sz w:val="26"/>
+            <w:szCs w:val="26"/>
+            <w:u w:val="none"/>
+            <w:lang w:val="vi-VN"/>
+          </w:rPr>
+          <w:t>.2.3 Yêu cầu phi chức năng</w:t>
+        </w:r>
+      </w:hyperlink>
+    </w:p>
+    <w:p>
+      <w:pPr>
+        <w:pStyle w:val="u3"/>
+        <w:spacing w:line="360" w:lineRule="auto"/>
+        <w:rPr>
+          <w:rFonts w:ascii="Times New Roman" w:eastAsiaTheme="minorEastAsia" w:hAnsi="Times New Roman" w:cs="Times New Roman"/>
+          <w:b/>
+          <w:kern w:val="2"/>
+          <w:lang w:val="vi-VN" w:eastAsia="vi-VN"/>
+          <w14:ligatures w14:val="standardContextual"/>
+        </w:rPr>
+      </w:pPr>
+      <w:hyperlink w:anchor="_Toc242195412" w:history="1">
+        <w:r>
+          <w:rPr>
+            <w:rStyle w:val="Siuktni"/>
+            <w:rFonts w:ascii="Times New Roman" w:hAnsi="Times New Roman"/>
+            <w:iCs/>
+            <w:color w:val="auto"/>
+            <w:szCs w:val="26"/>
+            <w:u w:val="none"/>
+            <w:lang w:val="vi-VN"/>
+          </w:rPr>
+          <w:t>2</w:t>
+        </w:r>
+        <w:r>
+          <w:rPr>
+            <w:rStyle w:val="Siuktni"/>
+            <w:rFonts w:ascii="Times New Roman" w:hAnsi="Times New Roman" w:cs="Times New Roman"/>
+            <w:iCs/>
+            <w:color w:val="auto"/>
+            <w:sz w:val="26"/>
+            <w:szCs w:val="26"/>
+            <w:u w:val="none"/>
+            <w:lang w:val="vi-VN"/>
+          </w:rPr>
+          <w:t>.2.4 Tác nhân của hệ thống</w:t>
+        </w:r>
+      </w:hyperlink>
+    </w:p>
+    <w:p>
+      <w:pPr>
+        <w:pStyle w:val="u3"/>
+        <w:spacing w:line="360" w:lineRule="auto"/>
+        <w:rPr>
+          <w:rFonts w:ascii="Times New Roman" w:eastAsiaTheme="minorEastAsia" w:hAnsi="Times New Roman" w:cs="Times New Roman"/>
+          <w:b/>
+          <w:kern w:val="2"/>
+          <w:lang w:val="vi-VN" w:eastAsia="vi-VN"/>
+          <w14:ligatures w14:val="standardContextual"/>
+        </w:rPr>
+      </w:pPr>
+      <w:hyperlink w:anchor="_Toc242195413" w:history="1">
+        <w:r>
+          <w:rPr>
+            <w:rStyle w:val="Siuktni"/>
+            <w:rFonts w:ascii="Times New Roman" w:hAnsi="Times New Roman"/>
+            <w:iCs/>
+            <w:color w:val="auto"/>
+            <w:szCs w:val="26"/>
+            <w:u w:val="none"/>
+            <w:lang w:val="vi-VN"/>
+          </w:rPr>
+          <w:t>2</w:t>
+        </w:r>
+        <w:r>
+          <w:rPr>
+            <w:rStyle w:val="Siuktni"/>
+            <w:rFonts w:ascii="Times New Roman" w:hAnsi="Times New Roman" w:cs="Times New Roman"/>
+            <w:iCs/>
+            <w:color w:val="auto"/>
+            <w:sz w:val="26"/>
+            <w:szCs w:val="26"/>
+            <w:u w:val="none"/>
+            <w:lang w:val="vi-VN"/>
+          </w:rPr>
+          <w:t xml:space="preserve">.2.5 Xác định các </w:t>
+        </w:r>
+        <w:proofErr w:type="spellStart"/>
+        <w:r>
+          <w:rPr>
+            <w:rStyle w:val="Siuktni"/>
+            <w:rFonts w:ascii="Times New Roman" w:hAnsi="Times New Roman" w:cs="Times New Roman"/>
+            <w:iCs/>
+            <w:color w:val="auto"/>
+            <w:sz w:val="26"/>
+            <w:szCs w:val="26"/>
+            <w:u w:val="none"/>
+            <w:lang w:val="vi-VN"/>
+          </w:rPr>
+          <w:t>UseCase</w:t>
+        </w:r>
+        <w:proofErr w:type="spellEnd"/>
+      </w:hyperlink>
+    </w:p>
+    <w:p>
+      <w:pPr>
+        <w:pStyle w:val="u3"/>
+        <w:spacing w:line="360" w:lineRule="auto"/>
+        <w:rPr>
+          <w:rFonts w:ascii="Times New Roman" w:eastAsiaTheme="minorEastAsia" w:hAnsi="Times New Roman" w:cs="Times New Roman"/>
+          <w:b/>
+          <w:kern w:val="2"/>
+          <w:lang w:val="vi-VN" w:eastAsia="vi-VN"/>
+          <w14:ligatures w14:val="standardContextual"/>
+        </w:rPr>
+      </w:pPr>
+      <w:hyperlink w:anchor="_Toc242195414" w:history="1">
+        <w:r>
+          <w:rPr>
+            <w:rStyle w:val="Siuktni"/>
+            <w:rFonts w:ascii="Times New Roman" w:hAnsi="Times New Roman"/>
+            <w:iCs/>
+            <w:color w:val="auto"/>
+            <w:szCs w:val="26"/>
+            <w:u w:val="none"/>
+            <w:lang w:val="vi-VN"/>
+          </w:rPr>
+          <w:t>2</w:t>
+        </w:r>
+        <w:r>
+          <w:rPr>
+            <w:rStyle w:val="Siuktni"/>
+            <w:rFonts w:ascii="Times New Roman" w:hAnsi="Times New Roman" w:cs="Times New Roman"/>
+            <w:iCs/>
+            <w:color w:val="auto"/>
+            <w:sz w:val="26"/>
+            <w:szCs w:val="26"/>
+            <w:u w:val="none"/>
+            <w:lang w:val="vi-VN"/>
+          </w:rPr>
+          <w:t xml:space="preserve">.2.5 Biểu đồ </w:t>
+        </w:r>
+        <w:proofErr w:type="spellStart"/>
+        <w:r>
+          <w:rPr>
+            <w:rStyle w:val="Siuktni"/>
+            <w:rFonts w:ascii="Times New Roman" w:hAnsi="Times New Roman" w:cs="Times New Roman"/>
+            <w:iCs/>
+            <w:color w:val="auto"/>
+            <w:sz w:val="26"/>
+            <w:szCs w:val="26"/>
+            <w:u w:val="none"/>
+            <w:lang w:val="vi-VN"/>
+          </w:rPr>
+          <w:t>UseCase</w:t>
+        </w:r>
+        <w:proofErr w:type="spellEnd"/>
+        <w:r>
+          <w:rPr>
+            <w:rStyle w:val="Siuktni"/>
+            <w:rFonts w:ascii="Times New Roman" w:hAnsi="Times New Roman" w:cs="Times New Roman"/>
+            <w:iCs/>
+            <w:color w:val="auto"/>
+            <w:sz w:val="26"/>
+            <w:szCs w:val="26"/>
+            <w:u w:val="none"/>
+            <w:lang w:val="vi-VN"/>
+          </w:rPr>
+          <w:t xml:space="preserve"> phân cấp chức năng</w:t>
+        </w:r>
+      </w:hyperlink>
+    </w:p>
+    <w:p>
+      <w:pPr>
+        <w:pStyle w:val="u3"/>
+        <w:spacing w:line="360" w:lineRule="auto"/>
+        <w:rPr>
+          <w:rFonts w:ascii="Times New Roman" w:eastAsiaTheme="minorEastAsia" w:hAnsi="Times New Roman" w:cs="Times New Roman"/>
+          <w:b/>
+          <w:kern w:val="2"/>
+          <w:lang w:val="vi-VN" w:eastAsia="vi-VN"/>
+          <w14:ligatures w14:val="standardContextual"/>
+        </w:rPr>
+      </w:pPr>
+      <w:hyperlink w:anchor="_Toc242195415" w:history="1">
+        <w:r>
+          <w:rPr>
+            <w:rStyle w:val="Siuktni"/>
+            <w:rFonts w:ascii="Times New Roman" w:hAnsi="Times New Roman"/>
+            <w:iCs/>
+            <w:color w:val="auto"/>
+            <w:szCs w:val="26"/>
+            <w:u w:val="none"/>
+            <w:lang w:val="vi-VN"/>
+          </w:rPr>
+          <w:t>2</w:t>
+        </w:r>
+        <w:r>
+          <w:rPr>
+            <w:rStyle w:val="Siuktni"/>
+            <w:rFonts w:ascii="Times New Roman" w:hAnsi="Times New Roman" w:cs="Times New Roman"/>
+            <w:iCs/>
+            <w:color w:val="auto"/>
+            <w:sz w:val="26"/>
+            <w:szCs w:val="26"/>
+            <w:u w:val="none"/>
+            <w:lang w:val="vi-VN"/>
+          </w:rPr>
+          <w:t xml:space="preserve">.2.6 Biểu đồ </w:t>
+        </w:r>
+        <w:proofErr w:type="spellStart"/>
+        <w:r>
+          <w:rPr>
+            <w:rStyle w:val="Siuktni"/>
+            <w:rFonts w:ascii="Times New Roman" w:hAnsi="Times New Roman" w:cs="Times New Roman"/>
+            <w:iCs/>
+            <w:color w:val="auto"/>
+            <w:sz w:val="26"/>
+            <w:szCs w:val="26"/>
+            <w:u w:val="none"/>
+            <w:lang w:val="vi-VN"/>
+          </w:rPr>
+          <w:t>UseCase</w:t>
+        </w:r>
+        <w:proofErr w:type="spellEnd"/>
+        <w:r>
+          <w:rPr>
+            <w:rStyle w:val="Siuktni"/>
+            <w:rFonts w:ascii="Times New Roman" w:hAnsi="Times New Roman" w:cs="Times New Roman"/>
+            <w:iCs/>
+            <w:color w:val="auto"/>
+            <w:sz w:val="26"/>
+            <w:szCs w:val="26"/>
+            <w:u w:val="none"/>
+            <w:lang w:val="vi-VN"/>
+          </w:rPr>
+          <w:t xml:space="preserve"> tổng quát</w:t>
+        </w:r>
+      </w:hyperlink>
+    </w:p>
+    <w:p>
+      <w:pPr>
+        <w:pStyle w:val="u3"/>
+        <w:spacing w:line="360" w:lineRule="auto"/>
+        <w:rPr>
+          <w:lang w:val="vi-VN"/>
+        </w:rPr>
+      </w:pPr>
+      <w:hyperlink w:anchor="_Toc242195416" w:history="1">
+        <w:r>
+          <w:rPr>
+            <w:rStyle w:val="Siuktni"/>
+            <w:rFonts w:ascii="Times New Roman" w:hAnsi="Times New Roman"/>
+            <w:iCs/>
+            <w:color w:val="auto"/>
+            <w:szCs w:val="26"/>
+            <w:u w:val="none"/>
+            <w:lang w:val="vi-VN"/>
+          </w:rPr>
+          <w:t>2</w:t>
+        </w:r>
+        <w:r>
+          <w:rPr>
+            <w:rStyle w:val="Siuktni"/>
+            <w:rFonts w:ascii="Times New Roman" w:hAnsi="Times New Roman" w:cs="Times New Roman"/>
+            <w:iCs/>
+            <w:color w:val="auto"/>
+            <w:sz w:val="26"/>
+            <w:szCs w:val="26"/>
+            <w:u w:val="none"/>
+            <w:lang w:val="vi-VN"/>
+          </w:rPr>
+          <w:t xml:space="preserve">.2.7 Biểu đồ </w:t>
+        </w:r>
+        <w:proofErr w:type="spellStart"/>
+        <w:r>
+          <w:rPr>
+            <w:rStyle w:val="Siuktni"/>
+            <w:rFonts w:ascii="Times New Roman" w:hAnsi="Times New Roman" w:cs="Times New Roman"/>
+            <w:iCs/>
+            <w:color w:val="auto"/>
+            <w:sz w:val="26"/>
+            <w:szCs w:val="26"/>
+            <w:u w:val="none"/>
+            <w:lang w:val="vi-VN"/>
+          </w:rPr>
+          <w:t>use</w:t>
+        </w:r>
+        <w:proofErr w:type="spellEnd"/>
+        <w:r>
+          <w:rPr>
+            <w:rStyle w:val="Siuktni"/>
+            <w:rFonts w:ascii="Times New Roman" w:hAnsi="Times New Roman" w:cs="Times New Roman"/>
+            <w:iCs/>
+            <w:color w:val="auto"/>
+            <w:sz w:val="26"/>
+            <w:szCs w:val="26"/>
+            <w:u w:val="none"/>
+            <w:lang w:val="vi-VN"/>
+          </w:rPr>
+          <w:t xml:space="preserve"> </w:t>
+        </w:r>
+        <w:proofErr w:type="spellStart"/>
+        <w:r>
+          <w:rPr>
+            <w:rStyle w:val="Siuktni"/>
+            <w:rFonts w:ascii="Times New Roman" w:hAnsi="Times New Roman" w:cs="Times New Roman"/>
+            <w:iCs/>
+            <w:color w:val="auto"/>
+            <w:sz w:val="26"/>
+            <w:szCs w:val="26"/>
+            <w:u w:val="none"/>
+            <w:lang w:val="vi-VN"/>
+          </w:rPr>
+          <w:t>case</w:t>
+        </w:r>
+        <w:proofErr w:type="spellEnd"/>
+        <w:r>
+          <w:rPr>
+            <w:rStyle w:val="Siuktni"/>
+            <w:rFonts w:ascii="Times New Roman" w:hAnsi="Times New Roman" w:cs="Times New Roman"/>
+            <w:iCs/>
+            <w:color w:val="auto"/>
+            <w:sz w:val="26"/>
+            <w:szCs w:val="26"/>
+            <w:u w:val="none"/>
+            <w:lang w:val="vi-VN"/>
+          </w:rPr>
+          <w:t xml:space="preserve"> phân rã chức năng</w:t>
+        </w:r>
+        <w:r>
+          <w:rPr>
+            <w:rFonts w:ascii="Times New Roman" w:hAnsi="Times New Roman" w:cs="Times New Roman"/>
+            <w:webHidden/>
+            <w:lang w:val="vi-VN"/>
+          </w:rPr>
+          <w:tab/>
+        </w:r>
+      </w:hyperlink>
+    </w:p>
+    <w:p>
+      <w:pPr>
+        <w:pStyle w:val="u2"/>
+        <w:spacing w:line="360" w:lineRule="auto"/>
+        <w:rPr>
+          <w:rFonts w:ascii="Times New Roman" w:hAnsi="Times New Roman" w:cs="Times New Roman"/>
+          <w:lang w:val="vi-VN"/>
+        </w:rPr>
+      </w:pPr>
+      <w:r>
+        <w:rPr>
+          <w:rFonts w:ascii="Times New Roman" w:hAnsi="Times New Roman" w:cs="Times New Roman"/>
+          <w:color w:val="auto"/>
+          <w:lang w:val="vi-VN"/>
+        </w:rPr>
+        <w:t>2.3 Thiết kế hệ thống</w:t>
+      </w:r>
+      <w:r>
+        <w:rPr>
+          <w:rFonts w:ascii="Times New Roman" w:hAnsi="Times New Roman" w:cs="Times New Roman"/>
+          <w:lang w:val="vi-VN"/>
+        </w:rPr>
+        <w:t xml:space="preserve"> </w:t>
+      </w:r>
+    </w:p>
+    <w:p>
+      <w:pPr>
+        <w:pStyle w:val="u3"/>
+        <w:spacing w:line="360" w:lineRule="auto"/>
+        <w:rPr>
+          <w:rFonts w:ascii="Times New Roman" w:eastAsiaTheme="minorEastAsia" w:hAnsi="Times New Roman" w:cs="Times New Roman"/>
+          <w:b/>
+          <w:kern w:val="2"/>
+          <w:lang w:val="vi-VN" w:eastAsia="vi-VN"/>
+          <w14:ligatures w14:val="standardContextual"/>
+        </w:rPr>
+      </w:pPr>
+      <w:hyperlink w:anchor="_Toc242195417" w:history="1">
+        <w:r>
+          <w:rPr>
+            <w:rStyle w:val="Siuktni"/>
+            <w:rFonts w:ascii="Times New Roman" w:hAnsi="Times New Roman"/>
+            <w:iCs/>
+            <w:color w:val="auto"/>
+            <w:szCs w:val="26"/>
+            <w:u w:val="none"/>
+            <w:lang w:val="vi-VN"/>
+          </w:rPr>
+          <w:t>2</w:t>
+        </w:r>
+        <w:r>
+          <w:rPr>
+            <w:rStyle w:val="Siuktni"/>
+            <w:rFonts w:ascii="Times New Roman" w:hAnsi="Times New Roman" w:cs="Times New Roman"/>
+            <w:iCs/>
+            <w:color w:val="auto"/>
+            <w:sz w:val="26"/>
+            <w:szCs w:val="26"/>
+            <w:u w:val="none"/>
+            <w:lang w:val="vi-VN"/>
+          </w:rPr>
+          <w:t>.3.1 Biểu đồ hoạt động</w:t>
+        </w:r>
+      </w:hyperlink>
+    </w:p>
+    <w:p>
+      <w:pPr>
+        <w:pStyle w:val="u3"/>
+        <w:spacing w:line="360" w:lineRule="auto"/>
+        <w:rPr>
+          <w:rFonts w:ascii="Times New Roman" w:eastAsiaTheme="minorEastAsia" w:hAnsi="Times New Roman" w:cs="Times New Roman"/>
+          <w:b/>
+          <w:kern w:val="2"/>
+          <w:lang w:val="vi-VN" w:eastAsia="vi-VN"/>
+          <w14:ligatures w14:val="standardContextual"/>
+        </w:rPr>
+      </w:pPr>
+      <w:hyperlink w:anchor="_Toc242195418" w:history="1">
+        <w:r>
+          <w:rPr>
+            <w:rStyle w:val="Siuktni"/>
+            <w:rFonts w:ascii="Times New Roman" w:hAnsi="Times New Roman"/>
+            <w:iCs/>
+            <w:color w:val="auto"/>
+            <w:szCs w:val="26"/>
+            <w:u w:val="none"/>
+            <w:lang w:val="vi-VN"/>
+          </w:rPr>
+          <w:t>2</w:t>
+        </w:r>
+        <w:r>
+          <w:rPr>
+            <w:rStyle w:val="Siuktni"/>
+            <w:rFonts w:ascii="Times New Roman" w:hAnsi="Times New Roman" w:cs="Times New Roman"/>
+            <w:iCs/>
+            <w:color w:val="auto"/>
+            <w:sz w:val="26"/>
+            <w:szCs w:val="26"/>
+            <w:u w:val="none"/>
+            <w:lang w:val="vi-VN"/>
+          </w:rPr>
+          <w:t>.3.2 Biểu đồ tuần tự</w:t>
+        </w:r>
+      </w:hyperlink>
+    </w:p>
+    <w:p>
+      <w:pPr>
+        <w:pStyle w:val="u3"/>
+        <w:spacing w:line="360" w:lineRule="auto"/>
+        <w:rPr>
+          <w:rFonts w:ascii="Times New Roman" w:eastAsiaTheme="minorEastAsia" w:hAnsi="Times New Roman" w:cs="Times New Roman"/>
+          <w:b/>
+          <w:kern w:val="2"/>
+          <w:lang w:val="vi-VN" w:eastAsia="vi-VN"/>
+          <w14:ligatures w14:val="standardContextual"/>
+        </w:rPr>
+      </w:pPr>
+      <w:hyperlink w:anchor="_Toc242195419" w:history="1">
+        <w:r>
+          <w:rPr>
+            <w:rStyle w:val="Siuktni"/>
+            <w:rFonts w:ascii="Times New Roman" w:hAnsi="Times New Roman"/>
+            <w:iCs/>
+            <w:color w:val="auto"/>
+            <w:szCs w:val="26"/>
+            <w:u w:val="none"/>
+            <w:lang w:val="vi-VN"/>
+          </w:rPr>
+          <w:t>2</w:t>
+        </w:r>
+        <w:r>
+          <w:rPr>
+            <w:rStyle w:val="Siuktni"/>
+            <w:rFonts w:ascii="Times New Roman" w:hAnsi="Times New Roman" w:cs="Times New Roman"/>
+            <w:iCs/>
+            <w:color w:val="auto"/>
+            <w:sz w:val="26"/>
+            <w:szCs w:val="26"/>
+            <w:u w:val="none"/>
+            <w:lang w:val="vi-VN"/>
+          </w:rPr>
+          <w:t>.3.3 Biểu đồ lớp</w:t>
+        </w:r>
+      </w:hyperlink>
+    </w:p>
+    <w:p>
+      <w:pPr>
+        <w:pStyle w:val="u3"/>
+        <w:spacing w:line="360" w:lineRule="auto"/>
+        <w:rPr>
+          <w:rFonts w:ascii="Times New Roman" w:eastAsiaTheme="minorEastAsia" w:hAnsi="Times New Roman" w:cs="Times New Roman"/>
+          <w:b/>
+          <w:kern w:val="2"/>
+          <w:lang w:val="vi-VN" w:eastAsia="vi-VN"/>
+          <w14:ligatures w14:val="standardContextual"/>
+        </w:rPr>
+      </w:pPr>
+      <w:hyperlink w:anchor="_Toc242195420" w:history="1">
+        <w:r>
+          <w:rPr>
+            <w:rStyle w:val="Siuktni"/>
+            <w:rFonts w:ascii="Times New Roman" w:hAnsi="Times New Roman"/>
+            <w:iCs/>
+            <w:color w:val="auto"/>
+            <w:szCs w:val="26"/>
+            <w:u w:val="none"/>
+            <w:lang w:val="vi-VN"/>
+          </w:rPr>
+          <w:t>2</w:t>
+        </w:r>
+        <w:r>
+          <w:rPr>
+            <w:rStyle w:val="Siuktni"/>
+            <w:rFonts w:ascii="Times New Roman" w:hAnsi="Times New Roman" w:cs="Times New Roman"/>
+            <w:iCs/>
+            <w:color w:val="auto"/>
+            <w:sz w:val="26"/>
+            <w:szCs w:val="26"/>
+            <w:u w:val="none"/>
+            <w:lang w:val="vi-VN"/>
+          </w:rPr>
+          <w:t>.3.4 Biểu đồ trạng thái</w:t>
+        </w:r>
+      </w:hyperlink>
+    </w:p>
+    <w:p>
+      <w:pPr>
+        <w:pStyle w:val="u3"/>
+        <w:spacing w:line="360" w:lineRule="auto"/>
+        <w:rPr>
+          <w:rFonts w:ascii="Times New Roman" w:eastAsiaTheme="minorEastAsia" w:hAnsi="Times New Roman" w:cs="Times New Roman"/>
+          <w:b/>
+          <w:kern w:val="2"/>
+          <w:lang w:val="vi-VN" w:eastAsia="vi-VN"/>
+          <w14:ligatures w14:val="standardContextual"/>
+        </w:rPr>
+      </w:pPr>
+      <w:hyperlink w:anchor="_Toc242195421" w:history="1">
+        <w:r>
+          <w:rPr>
+            <w:rStyle w:val="Siuktni"/>
+            <w:rFonts w:ascii="Times New Roman" w:hAnsi="Times New Roman"/>
+            <w:iCs/>
+            <w:color w:val="auto"/>
+            <w:szCs w:val="26"/>
+            <w:u w:val="none"/>
+            <w:lang w:val="vi-VN"/>
+          </w:rPr>
+          <w:t>2</w:t>
+        </w:r>
+        <w:r>
+          <w:rPr>
+            <w:rStyle w:val="Siuktni"/>
+            <w:rFonts w:ascii="Times New Roman" w:hAnsi="Times New Roman" w:cs="Times New Roman"/>
+            <w:iCs/>
+            <w:color w:val="auto"/>
+            <w:sz w:val="26"/>
+            <w:szCs w:val="26"/>
+            <w:u w:val="none"/>
+            <w:lang w:val="vi-VN"/>
+          </w:rPr>
+          <w:t>.3.5 Biểu đồ thành phần</w:t>
+        </w:r>
+      </w:hyperlink>
+    </w:p>
+    <w:p>
+      <w:pPr>
+        <w:pStyle w:val="u3"/>
+        <w:spacing w:line="360" w:lineRule="auto"/>
+        <w:rPr>
+          <w:rFonts w:ascii="Times New Roman" w:eastAsiaTheme="minorEastAsia" w:hAnsi="Times New Roman" w:cs="Times New Roman"/>
+          <w:b/>
+          <w:kern w:val="2"/>
+          <w:lang w:val="vi-VN" w:eastAsia="vi-VN"/>
+          <w14:ligatures w14:val="standardContextual"/>
+        </w:rPr>
+      </w:pPr>
+      <w:hyperlink w:anchor="_Toc242195422" w:history="1">
+        <w:r>
+          <w:rPr>
+            <w:rStyle w:val="Siuktni"/>
+            <w:rFonts w:ascii="Times New Roman" w:hAnsi="Times New Roman"/>
+            <w:iCs/>
+            <w:color w:val="auto"/>
+            <w:szCs w:val="26"/>
+            <w:u w:val="none"/>
+            <w:lang w:val="vi-VN"/>
+          </w:rPr>
+          <w:t>2</w:t>
+        </w:r>
+        <w:r>
+          <w:rPr>
+            <w:rStyle w:val="Siuktni"/>
+            <w:rFonts w:ascii="Times New Roman" w:hAnsi="Times New Roman" w:cs="Times New Roman"/>
+            <w:iCs/>
+            <w:color w:val="auto"/>
+            <w:sz w:val="26"/>
+            <w:szCs w:val="26"/>
+            <w:u w:val="none"/>
+            <w:lang w:val="vi-VN"/>
+          </w:rPr>
+          <w:t>.3.6 Biểu đồ triển khai</w:t>
+        </w:r>
+      </w:hyperlink>
+    </w:p>
+    <w:p>
+      <w:pPr>
+        <w:pStyle w:val="u3"/>
+        <w:spacing w:line="360" w:lineRule="auto"/>
+        <w:rPr>
+          <w:rFonts w:ascii="Times New Roman" w:eastAsiaTheme="minorEastAsia" w:hAnsi="Times New Roman" w:cs="Times New Roman"/>
+          <w:b/>
+          <w:kern w:val="2"/>
+          <w:lang w:val="vi-VN" w:eastAsia="vi-VN"/>
+          <w14:ligatures w14:val="standardContextual"/>
+        </w:rPr>
+      </w:pPr>
+      <w:hyperlink w:anchor="_Toc242195423" w:history="1">
+        <w:r>
+          <w:rPr>
+            <w:rStyle w:val="Siuktni"/>
+            <w:rFonts w:ascii="Times New Roman" w:hAnsi="Times New Roman"/>
+            <w:iCs/>
+            <w:color w:val="auto"/>
+            <w:szCs w:val="26"/>
+            <w:u w:val="none"/>
+            <w:lang w:val="vi-VN"/>
+          </w:rPr>
+          <w:t>2</w:t>
+        </w:r>
+        <w:r>
+          <w:rPr>
+            <w:rStyle w:val="Siuktni"/>
+            <w:rFonts w:ascii="Times New Roman" w:hAnsi="Times New Roman" w:cs="Times New Roman"/>
+            <w:iCs/>
+            <w:color w:val="auto"/>
+            <w:sz w:val="26"/>
+            <w:szCs w:val="26"/>
+            <w:u w:val="none"/>
+            <w:lang w:val="vi-VN"/>
+          </w:rPr>
+          <w:t>.3.7 Biểu đồ quan hệ thực thể</w:t>
+        </w:r>
+      </w:hyperlink>
+    </w:p>
+    <w:p>
+      <w:pPr>
+        <w:pStyle w:val="u3"/>
+        <w:spacing w:line="360" w:lineRule="auto"/>
+        <w:rPr>
+          <w:rFonts w:ascii="Times New Roman" w:eastAsiaTheme="minorEastAsia" w:hAnsi="Times New Roman" w:cs="Times New Roman"/>
+          <w:b/>
+          <w:kern w:val="2"/>
+          <w:lang w:val="vi-VN" w:eastAsia="vi-VN"/>
+          <w14:ligatures w14:val="standardContextual"/>
+        </w:rPr>
+      </w:pPr>
+      <w:hyperlink w:anchor="_Toc242195424" w:history="1">
+        <w:r>
+          <w:rPr>
+            <w:rStyle w:val="Siuktni"/>
+            <w:rFonts w:ascii="Times New Roman" w:hAnsi="Times New Roman"/>
+            <w:iCs/>
+            <w:color w:val="auto"/>
+            <w:szCs w:val="26"/>
+            <w:u w:val="none"/>
+            <w:lang w:val="vi-VN"/>
+          </w:rPr>
+          <w:t>2</w:t>
+        </w:r>
+        <w:r>
+          <w:rPr>
+            <w:rStyle w:val="Siuktni"/>
+            <w:rFonts w:ascii="Times New Roman" w:hAnsi="Times New Roman" w:cs="Times New Roman"/>
+            <w:iCs/>
+            <w:color w:val="auto"/>
+            <w:sz w:val="26"/>
+            <w:szCs w:val="26"/>
+            <w:u w:val="none"/>
+            <w:lang w:val="vi-VN"/>
+          </w:rPr>
+          <w:t>.3.8 Thiết kế cơ sở dữ</w:t>
+        </w:r>
+      </w:hyperlink>
+    </w:p>
+    <w:p>
+      <w:pPr>
+        <w:pStyle w:val="u3"/>
+        <w:spacing w:line="360" w:lineRule="auto"/>
+        <w:rPr>
+          <w:rFonts w:ascii="Times New Roman" w:eastAsiaTheme="minorEastAsia" w:hAnsi="Times New Roman" w:cs="Times New Roman"/>
+          <w:b/>
+          <w:kern w:val="2"/>
+          <w:lang w:val="vi-VN" w:eastAsia="vi-VN"/>
+          <w14:ligatures w14:val="standardContextual"/>
+        </w:rPr>
+      </w:pPr>
+      <w:hyperlink w:anchor="_Toc242195425" w:history="1">
+        <w:r>
+          <w:rPr>
+            <w:rStyle w:val="Siuktni"/>
+            <w:rFonts w:ascii="Times New Roman" w:hAnsi="Times New Roman"/>
+            <w:iCs/>
+            <w:color w:val="auto"/>
+            <w:szCs w:val="26"/>
+            <w:u w:val="none"/>
+            <w:lang w:val="vi-VN"/>
+          </w:rPr>
+          <w:t>2</w:t>
+        </w:r>
+        <w:r>
+          <w:rPr>
+            <w:rStyle w:val="Siuktni"/>
+            <w:rFonts w:ascii="Times New Roman" w:hAnsi="Times New Roman" w:cs="Times New Roman"/>
+            <w:iCs/>
+            <w:color w:val="auto"/>
+            <w:sz w:val="26"/>
+            <w:szCs w:val="26"/>
+            <w:u w:val="none"/>
+            <w:lang w:val="vi-VN"/>
+          </w:rPr>
+          <w:t>.3.</w:t>
+        </w:r>
+        <w:r>
+          <w:rPr>
+            <w:rStyle w:val="Siuktni"/>
+            <w:rFonts w:ascii="Times New Roman" w:hAnsi="Times New Roman"/>
+            <w:iCs/>
+            <w:color w:val="auto"/>
+            <w:szCs w:val="26"/>
+            <w:u w:val="none"/>
+            <w:lang w:val="vi-VN"/>
+          </w:rPr>
+          <w:t>9</w:t>
+        </w:r>
+        <w:r>
+          <w:rPr>
+            <w:rStyle w:val="Siuktni"/>
+            <w:rFonts w:ascii="Times New Roman" w:hAnsi="Times New Roman" w:cs="Times New Roman"/>
+            <w:iCs/>
+            <w:color w:val="auto"/>
+            <w:sz w:val="26"/>
+            <w:szCs w:val="26"/>
+            <w:u w:val="none"/>
+            <w:lang w:val="vi-VN"/>
+          </w:rPr>
+          <w:t xml:space="preserve"> Thiết kế giao diện</w:t>
+        </w:r>
+      </w:hyperlink>
+    </w:p>
+    <w:p>
+      <w:pPr>
+        <w:pStyle w:val="u3"/>
         <w:rPr>
           <w:rFonts w:ascii="Times New Roman" w:hAnsi="Times New Roman"/>
           <w:b/>
@@ -26469,7 +27363,7 @@
   <w:abstractNum w:abstractNumId="0" w15:restartNumberingAfterBreak="0">
     <w:nsid w:val="008102AD"/>
     <w:multiLevelType w:val="multilevel"/>
-    <w:tmpl w:val="D214CDB6"/>
+    <w:tmpl w:val="0CFEBCA2"/>
     <w:lvl w:ilvl="0">
       <w:start w:val="1"/>
       <w:numFmt w:val="bullet"/>
@@ -26483,7 +27377,8 @@
       </w:pPr>
       <w:rPr>
         <w:rFonts w:ascii="Symbol" w:hAnsi="Symbol" w:hint="default"/>
-        <w:sz w:val="20"/>
+        <w:sz w:val="26"/>
+        <w:szCs w:val="26"/>
       </w:rPr>
     </w:lvl>
     <w:lvl w:ilvl="1" w:tentative="1">
@@ -26618,7 +27513,7 @@
   <w:abstractNum w:abstractNumId="1" w15:restartNumberingAfterBreak="0">
     <w:nsid w:val="09BC2180"/>
     <w:multiLevelType w:val="multilevel"/>
-    <w:tmpl w:val="E8325654"/>
+    <w:tmpl w:val="30F8F19C"/>
     <w:lvl w:ilvl="0">
       <w:start w:val="1"/>
       <w:numFmt w:val="bullet"/>
@@ -26632,7 +27527,8 @@
       </w:pPr>
       <w:rPr>
         <w:rFonts w:ascii="Symbol" w:hAnsi="Symbol" w:hint="default"/>
-        <w:sz w:val="20"/>
+        <w:sz w:val="26"/>
+        <w:szCs w:val="26"/>
       </w:rPr>
     </w:lvl>
     <w:lvl w:ilvl="1" w:tentative="1">
@@ -26767,7 +27663,7 @@
   <w:abstractNum w:abstractNumId="2" w15:restartNumberingAfterBreak="0">
     <w:nsid w:val="0BEF02E5"/>
     <w:multiLevelType w:val="multilevel"/>
-    <w:tmpl w:val="7DC0B05C"/>
+    <w:tmpl w:val="1B2CB612"/>
     <w:lvl w:ilvl="0">
       <w:start w:val="1"/>
       <w:numFmt w:val="bullet"/>
@@ -26781,7 +27677,8 @@
       </w:pPr>
       <w:rPr>
         <w:rFonts w:ascii="Symbol" w:hAnsi="Symbol" w:hint="default"/>
-        <w:sz w:val="20"/>
+        <w:sz w:val="26"/>
+        <w:szCs w:val="26"/>
       </w:rPr>
     </w:lvl>
     <w:lvl w:ilvl="1" w:tentative="1">
@@ -26916,7 +27813,7 @@
   <w:abstractNum w:abstractNumId="3" w15:restartNumberingAfterBreak="0">
     <w:nsid w:val="101E7F55"/>
     <w:multiLevelType w:val="multilevel"/>
-    <w:tmpl w:val="75BA0128"/>
+    <w:tmpl w:val="40E4B980"/>
     <w:lvl w:ilvl="0">
       <w:start w:val="1"/>
       <w:numFmt w:val="bullet"/>
@@ -26930,7 +27827,8 @@
       </w:pPr>
       <w:rPr>
         <w:rFonts w:ascii="Symbol" w:hAnsi="Symbol" w:hint="default"/>
-        <w:sz w:val="20"/>
+        <w:sz w:val="26"/>
+        <w:szCs w:val="26"/>
       </w:rPr>
     </w:lvl>
     <w:lvl w:ilvl="1" w:tentative="1">
@@ -27214,7 +28112,7 @@
   <w:abstractNum w:abstractNumId="5" w15:restartNumberingAfterBreak="0">
     <w:nsid w:val="18D149DB"/>
     <w:multiLevelType w:val="multilevel"/>
-    <w:tmpl w:val="3BA0B294"/>
+    <w:tmpl w:val="CB4251EA"/>
     <w:lvl w:ilvl="0">
       <w:start w:val="1"/>
       <w:numFmt w:val="bullet"/>
@@ -27228,7 +28126,8 @@
       </w:pPr>
       <w:rPr>
         <w:rFonts w:ascii="Symbol" w:hAnsi="Symbol" w:hint="default"/>
-        <w:sz w:val="20"/>
+        <w:sz w:val="26"/>
+        <w:szCs w:val="26"/>
       </w:rPr>
     </w:lvl>
     <w:lvl w:ilvl="1" w:tentative="1">
@@ -27363,7 +28262,7 @@
   <w:abstractNum w:abstractNumId="6" w15:restartNumberingAfterBreak="0">
     <w:nsid w:val="18FA6903"/>
     <w:multiLevelType w:val="multilevel"/>
-    <w:tmpl w:val="DC089E36"/>
+    <w:tmpl w:val="F692D03A"/>
     <w:lvl w:ilvl="0">
       <w:start w:val="1"/>
       <w:numFmt w:val="bullet"/>
@@ -27377,7 +28276,8 @@
       </w:pPr>
       <w:rPr>
         <w:rFonts w:ascii="Symbol" w:hAnsi="Symbol" w:hint="default"/>
-        <w:sz w:val="20"/>
+        <w:sz w:val="26"/>
+        <w:szCs w:val="26"/>
       </w:rPr>
     </w:lvl>
     <w:lvl w:ilvl="1" w:tentative="1">
@@ -27792,7 +28692,7 @@
   <w:abstractNum w:abstractNumId="9" w15:restartNumberingAfterBreak="0">
     <w:nsid w:val="219C24F0"/>
     <w:multiLevelType w:val="multilevel"/>
-    <w:tmpl w:val="849E3252"/>
+    <w:tmpl w:val="13B09496"/>
     <w:lvl w:ilvl="0">
       <w:start w:val="1"/>
       <w:numFmt w:val="bullet"/>
@@ -27806,7 +28706,8 @@
       </w:pPr>
       <w:rPr>
         <w:rFonts w:ascii="Symbol" w:hAnsi="Symbol" w:hint="default"/>
-        <w:sz w:val="20"/>
+        <w:sz w:val="26"/>
+        <w:szCs w:val="26"/>
       </w:rPr>
     </w:lvl>
     <w:lvl w:ilvl="1" w:tentative="1">
@@ -27941,7 +28842,7 @@
   <w:abstractNum w:abstractNumId="10" w15:restartNumberingAfterBreak="0">
     <w:nsid w:val="26E30BD9"/>
     <w:multiLevelType w:val="multilevel"/>
-    <w:tmpl w:val="6720A2B6"/>
+    <w:tmpl w:val="C4440F5E"/>
     <w:lvl w:ilvl="0">
       <w:start w:val="1"/>
       <w:numFmt w:val="bullet"/>
@@ -27955,7 +28856,8 @@
       </w:pPr>
       <w:rPr>
         <w:rFonts w:ascii="Symbol" w:hAnsi="Symbol" w:hint="default"/>
-        <w:sz w:val="20"/>
+        <w:sz w:val="26"/>
+        <w:szCs w:val="26"/>
       </w:rPr>
     </w:lvl>
     <w:lvl w:ilvl="1" w:tentative="1">
@@ -28090,7 +28992,7 @@
   <w:abstractNum w:abstractNumId="11" w15:restartNumberingAfterBreak="0">
     <w:nsid w:val="29317C4E"/>
     <w:multiLevelType w:val="multilevel"/>
-    <w:tmpl w:val="2DDCA4FE"/>
+    <w:tmpl w:val="40CA115E"/>
     <w:lvl w:ilvl="0">
       <w:start w:val="1"/>
       <w:numFmt w:val="bullet"/>
@@ -28104,7 +29006,8 @@
       </w:pPr>
       <w:rPr>
         <w:rFonts w:ascii="Symbol" w:hAnsi="Symbol" w:hint="default"/>
-        <w:sz w:val="20"/>
+        <w:sz w:val="26"/>
+        <w:szCs w:val="26"/>
       </w:rPr>
     </w:lvl>
     <w:lvl w:ilvl="1" w:tentative="1">
@@ -28239,7 +29142,7 @@
   <w:abstractNum w:abstractNumId="12" w15:restartNumberingAfterBreak="0">
     <w:nsid w:val="390526B3"/>
     <w:multiLevelType w:val="multilevel"/>
-    <w:tmpl w:val="940E5D04"/>
+    <w:tmpl w:val="4F3C03AC"/>
     <w:lvl w:ilvl="0">
       <w:start w:val="1"/>
       <w:numFmt w:val="bullet"/>
@@ -28253,7 +29156,8 @@
       </w:pPr>
       <w:rPr>
         <w:rFonts w:ascii="Symbol" w:hAnsi="Symbol" w:hint="default"/>
-        <w:sz w:val="20"/>
+        <w:sz w:val="26"/>
+        <w:szCs w:val="26"/>
       </w:rPr>
     </w:lvl>
     <w:lvl w:ilvl="1" w:tentative="1">
@@ -28388,7 +29292,7 @@
   <w:abstractNum w:abstractNumId="13" w15:restartNumberingAfterBreak="0">
     <w:nsid w:val="3B7C43C4"/>
     <w:multiLevelType w:val="multilevel"/>
-    <w:tmpl w:val="F95E16DA"/>
+    <w:tmpl w:val="FE3E31EE"/>
     <w:lvl w:ilvl="0">
       <w:start w:val="1"/>
       <w:numFmt w:val="bullet"/>
@@ -28402,7 +29306,8 @@
       </w:pPr>
       <w:rPr>
         <w:rFonts w:ascii="Symbol" w:hAnsi="Symbol" w:hint="default"/>
-        <w:sz w:val="20"/>
+        <w:sz w:val="26"/>
+        <w:szCs w:val="26"/>
       </w:rPr>
     </w:lvl>
     <w:lvl w:ilvl="1" w:tentative="1">
@@ -28686,7 +29591,7 @@
   <w:abstractNum w:abstractNumId="15" w15:restartNumberingAfterBreak="0">
     <w:nsid w:val="427413D5"/>
     <w:multiLevelType w:val="multilevel"/>
-    <w:tmpl w:val="25F81F18"/>
+    <w:tmpl w:val="57A6D682"/>
     <w:lvl w:ilvl="0">
       <w:start w:val="1"/>
       <w:numFmt w:val="bullet"/>
@@ -28700,7 +29605,8 @@
       </w:pPr>
       <w:rPr>
         <w:rFonts w:ascii="Symbol" w:hAnsi="Symbol" w:hint="default"/>
-        <w:sz w:val="20"/>
+        <w:sz w:val="26"/>
+        <w:szCs w:val="26"/>
       </w:rPr>
     </w:lvl>
     <w:lvl w:ilvl="1" w:tentative="1">
@@ -29124,7 +30030,7 @@
   <w:abstractNum w:abstractNumId="18" w15:restartNumberingAfterBreak="0">
     <w:nsid w:val="641E0E91"/>
     <w:multiLevelType w:val="multilevel"/>
-    <w:tmpl w:val="E4DEAEA6"/>
+    <w:tmpl w:val="AFEEAA56"/>
     <w:lvl w:ilvl="0">
       <w:start w:val="1"/>
       <w:numFmt w:val="bullet"/>
@@ -29138,7 +30044,8 @@
       </w:pPr>
       <w:rPr>
         <w:rFonts w:ascii="Symbol" w:hAnsi="Symbol" w:hint="default"/>
-        <w:sz w:val="20"/>
+        <w:sz w:val="26"/>
+        <w:szCs w:val="26"/>
       </w:rPr>
     </w:lvl>
     <w:lvl w:ilvl="1" w:tentative="1">
@@ -29273,7 +30180,7 @@
   <w:abstractNum w:abstractNumId="19" w15:restartNumberingAfterBreak="0">
     <w:nsid w:val="67295066"/>
     <w:multiLevelType w:val="multilevel"/>
-    <w:tmpl w:val="2F345130"/>
+    <w:tmpl w:val="E44EFFEE"/>
     <w:lvl w:ilvl="0">
       <w:start w:val="1"/>
       <w:numFmt w:val="bullet"/>
@@ -29287,7 +30194,8 @@
       </w:pPr>
       <w:rPr>
         <w:rFonts w:ascii="Symbol" w:hAnsi="Symbol" w:hint="default"/>
-        <w:sz w:val="20"/>
+        <w:sz w:val="26"/>
+        <w:szCs w:val="26"/>
       </w:rPr>
     </w:lvl>
     <w:lvl w:ilvl="1" w:tentative="1">
@@ -29562,7 +30470,7 @@
   <w:abstractNum w:abstractNumId="21" w15:restartNumberingAfterBreak="0">
     <w:nsid w:val="6A714514"/>
     <w:multiLevelType w:val="multilevel"/>
-    <w:tmpl w:val="92A2B876"/>
+    <w:tmpl w:val="D0CCBCD4"/>
     <w:lvl w:ilvl="0">
       <w:start w:val="1"/>
       <w:numFmt w:val="bullet"/>
@@ -29576,7 +30484,8 @@
       </w:pPr>
       <w:rPr>
         <w:rFonts w:ascii="Symbol" w:hAnsi="Symbol" w:hint="default"/>
-        <w:sz w:val="20"/>
+        <w:sz w:val="26"/>
+        <w:szCs w:val="26"/>
       </w:rPr>
     </w:lvl>
     <w:lvl w:ilvl="1" w:tentative="1">
@@ -29711,7 +30620,7 @@
   <w:abstractNum w:abstractNumId="22" w15:restartNumberingAfterBreak="0">
     <w:nsid w:val="6FCF2A5E"/>
     <w:multiLevelType w:val="multilevel"/>
-    <w:tmpl w:val="27287B70"/>
+    <w:tmpl w:val="B8FC4CA6"/>
     <w:lvl w:ilvl="0">
       <w:start w:val="1"/>
       <w:numFmt w:val="bullet"/>
@@ -29725,7 +30634,8 @@
       </w:pPr>
       <w:rPr>
         <w:rFonts w:ascii="Symbol" w:hAnsi="Symbol" w:hint="default"/>
-        <w:sz w:val="20"/>
+        <w:sz w:val="26"/>
+        <w:szCs w:val="26"/>
       </w:rPr>
     </w:lvl>
     <w:lvl w:ilvl="1" w:tentative="1">
@@ -29860,7 +30770,7 @@
   <w:abstractNum w:abstractNumId="23" w15:restartNumberingAfterBreak="0">
     <w:nsid w:val="77B94170"/>
     <w:multiLevelType w:val="multilevel"/>
-    <w:tmpl w:val="2F8C5C2C"/>
+    <w:tmpl w:val="F2AEC0CA"/>
     <w:lvl w:ilvl="0">
       <w:start w:val="1"/>
       <w:numFmt w:val="bullet"/>
@@ -29874,7 +30784,8 @@
       </w:pPr>
       <w:rPr>
         <w:rFonts w:ascii="Symbol" w:hAnsi="Symbol" w:hint="default"/>
-        <w:sz w:val="20"/>
+        <w:sz w:val="26"/>
+        <w:szCs w:val="26"/>
       </w:rPr>
     </w:lvl>
     <w:lvl w:ilvl="1" w:tentative="1">
@@ -30185,7 +31096,7 @@
     <w:lsdException w:name="Body Text Indent 2" w:semiHidden="1" w:unhideWhenUsed="1"/>
     <w:lsdException w:name="Body Text Indent 3" w:semiHidden="1" w:unhideWhenUsed="1"/>
     <w:lsdException w:name="Block Text" w:semiHidden="1" w:unhideWhenUsed="1"/>
-    <w:lsdException w:name="Hyperlink" w:semiHidden="1" w:uiPriority="0" w:unhideWhenUsed="1"/>
+    <w:lsdException w:name="Hyperlink" w:semiHidden="1" w:unhideWhenUsed="1"/>
     <w:lsdException w:name="FollowedHyperlink" w:semiHidden="1" w:unhideWhenUsed="1"/>
     <w:lsdException w:name="Strong" w:uiPriority="22" w:qFormat="1"/>
     <w:lsdException w:name="Emphasis" w:uiPriority="0" w:qFormat="1"/>
@@ -30656,6 +31567,7 @@
   </w:style>
   <w:style w:type="character" w:styleId="Siuktni">
     <w:name w:val="Hyperlink"/>
+    <w:uiPriority w:val="99"/>
     <w:rsid w:val="00DC1354"/>
     <w:rPr>
       <w:color w:val="0000FF"/>
@@ -30756,6 +31668,69 @@
       <w:color w:val="2E74B5" w:themeColor="accent1" w:themeShade="BF"/>
       <w:sz w:val="26"/>
       <w:szCs w:val="26"/>
+    </w:rPr>
+  </w:style>
+  <w:style w:type="paragraph" w:styleId="Mucluc1">
+    <w:name w:val="toc 1"/>
+    <w:basedOn w:val="Binhthng"/>
+    <w:next w:val="Binhthng"/>
+    <w:autoRedefine/>
+    <w:uiPriority w:val="39"/>
+    <w:unhideWhenUsed/>
+    <w:rsid w:val="00ED2472"/>
+    <w:pPr>
+      <w:spacing w:before="120" w:after="120" w:line="360" w:lineRule="auto"/>
+    </w:pPr>
+    <w:rPr>
+      <w:rFonts w:ascii="Times New Roman" w:hAnsi="Times New Roman"/>
+      <w:bCs/>
+      <w:iCs/>
+      <w:noProof/>
+      <w:szCs w:val="26"/>
+    </w:rPr>
+  </w:style>
+  <w:style w:type="paragraph" w:styleId="Mucluc2">
+    <w:name w:val="toc 2"/>
+    <w:basedOn w:val="Binhthng"/>
+    <w:next w:val="Binhthng"/>
+    <w:autoRedefine/>
+    <w:uiPriority w:val="39"/>
+    <w:unhideWhenUsed/>
+    <w:rsid w:val="00ED2472"/>
+    <w:pPr>
+      <w:tabs>
+        <w:tab w:val="right" w:leader="dot" w:pos="9345"/>
+      </w:tabs>
+      <w:spacing w:before="120" w:line="360" w:lineRule="auto"/>
+    </w:pPr>
+    <w:rPr>
+      <w:rFonts w:ascii="Times New Roman" w:hAnsi="Times New Roman" w:cs="Calibri"/>
+      <w:bCs/>
+      <w:noProof/>
+      <w:szCs w:val="22"/>
+    </w:rPr>
+  </w:style>
+  <w:style w:type="paragraph" w:styleId="Mucluc3">
+    <w:name w:val="toc 3"/>
+    <w:basedOn w:val="Binhthng"/>
+    <w:next w:val="Binhthng"/>
+    <w:autoRedefine/>
+    <w:uiPriority w:val="39"/>
+    <w:unhideWhenUsed/>
+    <w:rsid w:val="00ED2472"/>
+    <w:pPr>
+      <w:tabs>
+        <w:tab w:val="right" w:leader="dot" w:pos="9345"/>
+      </w:tabs>
+      <w:spacing w:after="100"/>
+      <w:ind w:left="480"/>
+    </w:pPr>
+    <w:rPr>
+      <w:rFonts w:ascii="Times New Roman" w:hAnsi="Times New Roman"/>
+      <w:b/>
+      <w:bCs/>
+      <w:noProof/>
+      <w:sz w:val="24"/>
     </w:rPr>
   </w:style>
 </w:styles>

</xml_diff>

<commit_message>
Update nội dung 1.2 Làm rõ các công nghệ sử dụng trong dự án
Cập nhật và chuẩn hóa mục 1.2 trong Chương 1 của báo cáo EAUT SUPPORT. Sắp xếp lại nội dung công nghệ theo các nhóm Frontend, Backend, Database và Công cụ hỗ trợ; bổ sung mô tả vai trò của từng công nghệ được sử dụng trong quá trình xây dựng hệ thống.
</commit_message>
<xml_diff>
--- a/Đề cương BTL_2026.docx
+++ b/Đề cương BTL_2026.docx
@@ -942,7 +942,9 @@
                 </w:tcPr>
                 <w:p>
                   <w:pPr>
+                    <w:framePr w:hSpace="181" w:wrap="around" w:vAnchor="page" w:hAnchor="margin" w:xAlign="center" w:y="1056"/>
                     <w:spacing w:line="360" w:lineRule="auto"/>
+                    <w:suppressOverlap/>
                     <w:rPr>
                       <w:rFonts w:ascii="Times New Roman" w:hAnsi="Times New Roman"/>
                       <w:b/>
@@ -1448,7 +1450,6 @@
               </w:rPr>
               <w:t xml:space="preserve"> </w:t>
             </w:r>
-            <w:proofErr w:type="spellStart"/>
             <w:r>
               <w:rPr>
                 <w:rFonts w:ascii="Times New Roman" w:hAnsi="Times New Roman"/>
@@ -1456,17 +1457,7 @@
                 <w:sz w:val="28"/>
                 <w:szCs w:val="28"/>
               </w:rPr>
-              <w:t>ThS</w:t>
-            </w:r>
-            <w:proofErr w:type="spellEnd"/>
-            <w:r>
-              <w:rPr>
-                <w:rFonts w:ascii="Times New Roman" w:hAnsi="Times New Roman"/>
-                <w:b/>
-                <w:sz w:val="28"/>
-                <w:szCs w:val="28"/>
-              </w:rPr>
-              <w:t xml:space="preserve">. </w:t>
+              <w:t xml:space="preserve">ThS. </w:t>
             </w:r>
             <w:r>
               <w:rPr>
@@ -3357,6 +3348,7 @@
           <w:szCs w:val="26"/>
           <w:lang w:val="vi-VN"/>
         </w:rPr>
+        <w:lastRenderedPageBreak/>
         <w:t xml:space="preserve">Nghiên cứu </w:t>
       </w:r>
       <w:proofErr w:type="spellStart"/>
@@ -3474,7 +3466,6 @@
           <w:szCs w:val="26"/>
           <w:lang w:val="vi-VN"/>
         </w:rPr>
-        <w:lastRenderedPageBreak/>
         <w:t xml:space="preserve">Nghiên cứu </w:t>
       </w:r>
       <w:proofErr w:type="spellStart"/>
@@ -4032,6 +4023,7 @@
           <w:szCs w:val="26"/>
           <w:lang w:val="vi-VN"/>
         </w:rPr>
+        <w:lastRenderedPageBreak/>
         <w:t>Kỹ thuật viên: có thể xem các yêu cầu được phân công, tiếp nhận yêu cầu, nhận xử lý, cập nhật tiến độ, yêu cầu bổ sung thông tin, hoàn thành yêu cầu và xem lịch sử xử lý.</w:t>
       </w:r>
     </w:p>
@@ -4053,7 +4045,6 @@
           <w:szCs w:val="26"/>
           <w:lang w:val="vi-VN"/>
         </w:rPr>
-        <w:lastRenderedPageBreak/>
         <w:t>Quản trị viên: quản lý tài khoản, vai trò, danh mục sự cố, phòng học/phòng làm việc, thiết bị, cấu hình SLA, yêu cầu hỗ trợ, thông báo, đánh giá và các thông tin thống kê của hệ thống.</w:t>
       </w:r>
     </w:p>
@@ -4421,6 +4412,7 @@
           <w:szCs w:val="26"/>
           <w:lang w:val="vi-VN"/>
         </w:rPr>
+        <w:lastRenderedPageBreak/>
         <w:t>Cập nhật tiến độ xử lý.</w:t>
       </w:r>
     </w:p>
@@ -4463,7 +4455,6 @@
           <w:szCs w:val="26"/>
           <w:lang w:val="vi-VN"/>
         </w:rPr>
-        <w:lastRenderedPageBreak/>
         <w:t>Tiếp tục xử lý sau khi người dùng bổ sung thông tin.</w:t>
       </w:r>
     </w:p>
@@ -4760,7 +4751,15 @@
           <w:szCs w:val="26"/>
           <w:lang w:val="vi-VN"/>
         </w:rPr>
-        <w:t>Đối với quản trị viên, đề tài cung cấp một giải pháp quản lý tổng thể các hoạt động hỗ trợ kỹ thuật trong trường. Quản trị viên có thể quản lý tài khoản, vai trò, danh mục sự cố, phòng, thiết bị, cấu hình SLA và theo dõi các yêu cầu hỗ trợ. Hệ thống đồng thời cung cấp các thông tin thống kê nhằm hỗ trợ quản trị viên đánh giá tình hình hoạt động và đưa ra các quyết định phù hợp.</w:t>
+        <w:t xml:space="preserve">Đối với quản trị viên, đề tài cung cấp một giải pháp quản lý tổng thể các hoạt động hỗ trợ kỹ thuật trong trường. Quản trị viên có thể quản lý tài khoản, vai trò, </w:t>
+      </w:r>
+      <w:r>
+        <w:rPr>
+          <w:szCs w:val="26"/>
+          <w:lang w:val="vi-VN"/>
+        </w:rPr>
+        <w:lastRenderedPageBreak/>
+        <w:t>danh mục sự cố, phòng, thiết bị, cấu hình SLA và theo dõi các yêu cầu hỗ trợ. Hệ thống đồng thời cung cấp các thông tin thống kê nhằm hỗ trợ quản trị viên đánh giá tình hình hoạt động và đưa ra các quyết định phù hợp.</w:t>
       </w:r>
     </w:p>
     <w:p>
@@ -4778,7 +4777,6 @@
           <w:szCs w:val="26"/>
           <w:lang w:val="vi-VN"/>
         </w:rPr>
-        <w:lastRenderedPageBreak/>
         <w:t>Việc tập trung dữ liệu trên một hệ thống duy nhất giúp hạn chế tình trạng thất lạc thông tin, giảm phụ thuộc vào phương thức trao đổi thủ công và tăng tính minh bạch trong quá trình xử lý yêu cầu. Người dùng có thể biết được yêu cầu của mình đang ở trạng thái nào, yêu cầu đã được tiếp nhận hay chưa và quá trình xử lý đang được thực hiện bởi bộ phận nào.</w:t>
       </w:r>
     </w:p>
@@ -5358,7 +5356,15 @@
           <w:szCs w:val="26"/>
           <w:lang w:val="vi-VN"/>
         </w:rPr>
-        <w:t xml:space="preserve"> và DTO. Cách tổ chức này giúp phân tách trách nhiệm giữa các thành phần, tăng khả năng bảo trì, kiểm thử và mở rộng hệ thống.</w:t>
+        <w:t xml:space="preserve"> và DTO. Cách tổ chức này giúp phân </w:t>
+      </w:r>
+      <w:r>
+        <w:rPr>
+          <w:szCs w:val="26"/>
+          <w:lang w:val="vi-VN"/>
+        </w:rPr>
+        <w:lastRenderedPageBreak/>
+        <w:t>tách trách nhiệm giữa các thành phần, tăng khả năng bảo trì, kiểm thử và mở rộng hệ thống.</w:t>
       </w:r>
     </w:p>
     <w:p>
@@ -5379,15 +5385,7 @@
           <w:szCs w:val="26"/>
           <w:lang w:val="vi-VN"/>
         </w:rPr>
-        <w:t xml:space="preserve">Ứng dụng cơ chế quản lý trạng thái yêu cầu: Hệ thống xây dựng quy trình chuyển trạng thái yêu cầu theo nghiệp vụ, hạn chế việc chuyển trạng thái </w:t>
-      </w:r>
-      <w:r>
-        <w:rPr>
-          <w:szCs w:val="26"/>
-          <w:lang w:val="vi-VN"/>
-        </w:rPr>
-        <w:lastRenderedPageBreak/>
-        <w:t>không hợp lệ. Điều này giúp đảm bảo tính nhất quán của dữ liệu và phản ánh chính xác tiến trình xử lý sự cố.</w:t>
+        <w:t>Ứng dụng cơ chế quản lý trạng thái yêu cầu: Hệ thống xây dựng quy trình chuyển trạng thái yêu cầu theo nghiệp vụ, hạn chế việc chuyển trạng thái không hợp lệ. Điều này giúp đảm bảo tính nhất quán của dữ liệu và phản ánh chính xác tiến trình xử lý sự cố.</w:t>
       </w:r>
     </w:p>
     <w:p>
@@ -5794,7 +5792,15 @@
           <w:szCs w:val="26"/>
           <w:lang w:val="vi-VN"/>
         </w:rPr>
-        <w:t xml:space="preserve"> và các công cụ hỗ trợ phát triển hệ thống. Bên cạnh đó, chương trình bày các kiến thức liên quan đến kiến trúc ứng dụng </w:t>
+        <w:t xml:space="preserve"> và các công cụ hỗ trợ phát triển hệ thống. Bên cạnh đó, chương trình bày các kiến thức liên </w:t>
+      </w:r>
+      <w:r>
+        <w:rPr>
+          <w:szCs w:val="26"/>
+          <w:lang w:val="vi-VN"/>
+        </w:rPr>
+        <w:lastRenderedPageBreak/>
+        <w:t xml:space="preserve">quan đến kiến trúc ứng dụng </w:t>
       </w:r>
       <w:proofErr w:type="spellStart"/>
       <w:r>
@@ -5831,15 +5837,7 @@
           <w:szCs w:val="26"/>
           <w:lang w:val="vi-VN"/>
         </w:rPr>
-        <w:t xml:space="preserve">Chương 3: Phân tích và thiết kế hệ thống. Chương này tập trung vào quá trình khảo sát, thu thập và phân tích yêu cầu hệ thống dành cho ba nhóm đối tượng: </w:t>
-      </w:r>
-      <w:r>
-        <w:rPr>
-          <w:szCs w:val="26"/>
-          <w:lang w:val="vi-VN"/>
-        </w:rPr>
-        <w:lastRenderedPageBreak/>
-        <w:t xml:space="preserve">Sinh viên, Kỹ thuật viên và Quản trị viên. Dựa trên các yêu cầu đó, chương trình bày chi tiết các bước thiết kế hệ thống thông qua hệ thống biểu đồ UML như </w:t>
+        <w:t xml:space="preserve">Chương 3: Phân tích và thiết kế hệ thống. Chương này tập trung vào quá trình khảo sát, thu thập và phân tích yêu cầu hệ thống dành cho ba nhóm đối tượng: Sinh viên, Kỹ thuật viên và Quản trị viên. Dựa trên các yêu cầu đó, chương trình bày chi tiết các bước thiết kế hệ thống thông qua hệ thống biểu đồ UML như </w:t>
       </w:r>
       <w:proofErr w:type="spellStart"/>
       <w:r>
@@ -14843,11 +14841,9 @@
     <w:p>
       <w:pPr>
         <w:spacing w:before="120" w:after="120" w:line="360" w:lineRule="auto"/>
-        <w:jc w:val="both"/>
         <w:rPr>
           <w:rFonts w:ascii="Times New Roman" w:hAnsi="Times New Roman"/>
           <w:b/>
-          <w:bCs/>
           <w:sz w:val="28"/>
           <w:szCs w:val="28"/>
           <w:lang w:val="vi-VN"/>
@@ -14861,237 +14857,1135 @@
           <w:szCs w:val="28"/>
           <w:lang w:val="vi-VN"/>
         </w:rPr>
-        <w:t>Chương 2</w:t>
-      </w:r>
-      <w:r>
-        <w:rPr>
-          <w:rFonts w:ascii="Times New Roman" w:hAnsi="Times New Roman"/>
+        <w:br w:type="page"/>
+      </w:r>
+    </w:p>
+    <w:p>
+      <w:pPr>
+        <w:pStyle w:val="u1"/>
+        <w:spacing w:line="360" w:lineRule="auto"/>
+        <w:jc w:val="center"/>
+        <w:rPr>
+          <w:rFonts w:ascii="Times New Roman" w:hAnsi="Times New Roman"/>
+          <w:bCs w:val="0"/>
+          <w:sz w:val="28"/>
+          <w:szCs w:val="28"/>
+          <w:lang w:val="vi-VN"/>
+        </w:rPr>
+      </w:pPr>
+      <w:r>
+        <w:rPr>
+          <w:rFonts w:ascii="Times New Roman" w:hAnsi="Times New Roman"/>
+          <w:bCs w:val="0"/>
+          <w:sz w:val="28"/>
+          <w:szCs w:val="28"/>
+          <w:lang w:val="vi-VN"/>
+        </w:rPr>
+        <w:lastRenderedPageBreak/>
+        <w:t xml:space="preserve">CHƯƠNG 2. </w:t>
+      </w:r>
+      <w:r>
+        <w:rPr>
+          <w:rFonts w:ascii="Times New Roman" w:hAnsi="Times New Roman"/>
+          <w:bCs w:val="0"/>
+          <w:sz w:val="28"/>
+          <w:szCs w:val="28"/>
+          <w:lang w:val="vi-VN"/>
+        </w:rPr>
+        <w:t>PHÂN TÍCH VÀ THIẾT KẾ HỆ THỐNG</w:t>
+      </w:r>
+    </w:p>
+    <w:p>
+      <w:pPr>
+        <w:pStyle w:val="u2"/>
+        <w:spacing w:line="360" w:lineRule="auto"/>
+        <w:rPr>
+          <w:rFonts w:ascii="Times New Roman" w:eastAsia="Times New Roman" w:hAnsi="Times New Roman" w:cs="Times New Roman"/>
+          <w:lang w:val="vi-VN"/>
+        </w:rPr>
+      </w:pPr>
+      <w:hyperlink w:anchor="_Toc242195404" w:history="1">
+        <w:r>
+          <w:rPr>
+            <w:rStyle w:val="Siuktni"/>
+            <w:rFonts w:ascii="Times New Roman" w:hAnsi="Times New Roman"/>
+            <w:iCs/>
+            <w:color w:val="auto"/>
+            <w:u w:val="none"/>
+            <w:lang w:val="vi-VN"/>
+          </w:rPr>
+          <w:t>2</w:t>
+        </w:r>
+        <w:r>
+          <w:rPr>
+            <w:rStyle w:val="Siuktni"/>
+            <w:rFonts w:ascii="Times New Roman" w:hAnsi="Times New Roman" w:cs="Times New Roman"/>
+            <w:iCs/>
+            <w:color w:val="auto"/>
+            <w:u w:val="none"/>
+            <w:lang w:val="vi-VN"/>
+          </w:rPr>
+          <w:t>.1. Khảo sát và phân tích yêu cầu hệ thống</w:t>
+        </w:r>
+      </w:hyperlink>
+    </w:p>
+    <w:p>
+      <w:pPr>
+        <w:pStyle w:val="u3"/>
+        <w:spacing w:line="360" w:lineRule="auto"/>
+        <w:rPr>
+          <w:rFonts w:ascii="Times New Roman" w:eastAsiaTheme="minorEastAsia" w:hAnsi="Times New Roman" w:cs="Times New Roman"/>
           <w:b/>
-          <w:sz w:val="28"/>
-          <w:szCs w:val="28"/>
-          <w:lang w:val="vi-VN"/>
-        </w:rPr>
-        <w:t>.</w:t>
-      </w:r>
-      <w:r>
-        <w:rPr>
-          <w:rFonts w:ascii="Times New Roman" w:hAnsi="Times New Roman"/>
+          <w:kern w:val="2"/>
+          <w:lang w:val="vi-VN" w:eastAsia="vi-VN"/>
+          <w14:ligatures w14:val="standardContextual"/>
+        </w:rPr>
+      </w:pPr>
+      <w:hyperlink w:anchor="_Toc242195405" w:history="1">
+        <w:r>
+          <w:rPr>
+            <w:rStyle w:val="Siuktni"/>
+            <w:rFonts w:ascii="Times New Roman" w:hAnsi="Times New Roman"/>
+            <w:iCs/>
+            <w:color w:val="auto"/>
+            <w:szCs w:val="26"/>
+            <w:u w:val="none"/>
+            <w:lang w:val="vi-VN"/>
+          </w:rPr>
+          <w:t>2</w:t>
+        </w:r>
+        <w:r>
+          <w:rPr>
+            <w:rStyle w:val="Siuktni"/>
+            <w:rFonts w:ascii="Times New Roman" w:hAnsi="Times New Roman" w:cs="Times New Roman"/>
+            <w:iCs/>
+            <w:color w:val="auto"/>
+            <w:sz w:val="26"/>
+            <w:szCs w:val="26"/>
+            <w:u w:val="none"/>
+            <w:lang w:val="vi-VN"/>
+          </w:rPr>
+          <w:t>.1.1 Cơ sở lý thuyết và vai trò thu thập yêu cầu</w:t>
+        </w:r>
+      </w:hyperlink>
+    </w:p>
+    <w:p>
+      <w:pPr>
+        <w:pStyle w:val="u3"/>
+        <w:spacing w:line="360" w:lineRule="auto"/>
+        <w:rPr>
+          <w:rFonts w:ascii="Times New Roman" w:eastAsiaTheme="minorEastAsia" w:hAnsi="Times New Roman" w:cs="Times New Roman"/>
           <w:b/>
-          <w:sz w:val="28"/>
-          <w:szCs w:val="28"/>
-          <w:lang w:val="vi-VN"/>
-        </w:rPr>
-        <w:t xml:space="preserve"> </w:t>
-      </w:r>
-      <w:r>
-        <w:rPr>
-          <w:rFonts w:ascii="Times New Roman" w:hAnsi="Times New Roman"/>
+          <w:kern w:val="2"/>
+          <w:lang w:val="vi-VN" w:eastAsia="vi-VN"/>
+          <w14:ligatures w14:val="standardContextual"/>
+        </w:rPr>
+      </w:pPr>
+      <w:hyperlink w:anchor="_Toc242195406" w:history="1">
+        <w:r>
+          <w:rPr>
+            <w:rStyle w:val="Siuktni"/>
+            <w:rFonts w:ascii="Times New Roman" w:hAnsi="Times New Roman"/>
+            <w:iCs/>
+            <w:color w:val="auto"/>
+            <w:szCs w:val="26"/>
+            <w:u w:val="none"/>
+            <w:lang w:val="vi-VN"/>
+          </w:rPr>
+          <w:t>2</w:t>
+        </w:r>
+        <w:r>
+          <w:rPr>
+            <w:rStyle w:val="Siuktni"/>
+            <w:rFonts w:ascii="Times New Roman" w:hAnsi="Times New Roman" w:cs="Times New Roman"/>
+            <w:iCs/>
+            <w:color w:val="auto"/>
+            <w:sz w:val="26"/>
+            <w:szCs w:val="26"/>
+            <w:u w:val="none"/>
+            <w:lang w:val="vi-VN"/>
+          </w:rPr>
+          <w:t>.1.2 Phương pháp thu thập yêu cầu và kết quả khảo sát thực tế</w:t>
+        </w:r>
+      </w:hyperlink>
+    </w:p>
+    <w:p>
+      <w:pPr>
+        <w:pStyle w:val="u3"/>
+        <w:spacing w:line="360" w:lineRule="auto"/>
+        <w:rPr>
+          <w:rFonts w:ascii="Times New Roman" w:eastAsiaTheme="minorEastAsia" w:hAnsi="Times New Roman" w:cs="Times New Roman"/>
           <w:b/>
-          <w:bCs/>
-          <w:sz w:val="28"/>
-          <w:szCs w:val="28"/>
-          <w:lang w:val="vi-VN"/>
-        </w:rPr>
-        <w:t>PHÂN TÍCH VÀ THIẾT KẾ HỆ THỐNG</w:t>
-      </w:r>
-    </w:p>
-    <w:p>
-      <w:pPr>
-        <w:spacing w:before="120" w:after="120" w:line="360" w:lineRule="auto"/>
-        <w:ind w:firstLine="567"/>
-        <w:jc w:val="both"/>
-        <w:rPr>
-          <w:rFonts w:ascii="Times New Roman" w:hAnsi="Times New Roman"/>
-          <w:sz w:val="28"/>
-          <w:szCs w:val="28"/>
-          <w:lang w:val="vi-VN"/>
-        </w:rPr>
-      </w:pPr>
-      <w:r>
-        <w:rPr>
-          <w:rFonts w:ascii="Times New Roman" w:hAnsi="Times New Roman"/>
-          <w:sz w:val="28"/>
-          <w:szCs w:val="28"/>
-          <w:lang w:val="vi-VN"/>
-        </w:rPr>
-        <w:t xml:space="preserve">tập trung vào các sơ đồ phân tích, </w:t>
-      </w:r>
-    </w:p>
-    <w:p>
-      <w:pPr>
-        <w:spacing w:before="120" w:after="120" w:line="360" w:lineRule="auto"/>
-        <w:ind w:firstLine="567"/>
-        <w:jc w:val="both"/>
-        <w:rPr>
-          <w:rFonts w:ascii="Times New Roman" w:hAnsi="Times New Roman"/>
-          <w:sz w:val="28"/>
-          <w:szCs w:val="28"/>
-          <w:lang w:val="vi-VN"/>
-        </w:rPr>
-      </w:pPr>
-      <w:r>
-        <w:rPr>
-          <w:rFonts w:ascii="Times New Roman" w:hAnsi="Times New Roman"/>
-          <w:sz w:val="28"/>
-          <w:szCs w:val="28"/>
-          <w:lang w:val="vi-VN"/>
-        </w:rPr>
-        <w:t xml:space="preserve">thiết kế, </w:t>
-      </w:r>
-    </w:p>
-    <w:p>
-      <w:pPr>
-        <w:spacing w:before="120" w:after="120" w:line="360" w:lineRule="auto"/>
-        <w:ind w:firstLine="567"/>
-        <w:jc w:val="both"/>
-        <w:rPr>
-          <w:rFonts w:ascii="Times New Roman" w:hAnsi="Times New Roman"/>
-          <w:sz w:val="28"/>
-          <w:szCs w:val="28"/>
-          <w:lang w:val="vi-VN"/>
-        </w:rPr>
-      </w:pPr>
-      <w:r>
-        <w:rPr>
-          <w:rFonts w:ascii="Times New Roman" w:hAnsi="Times New Roman"/>
-          <w:sz w:val="28"/>
-          <w:szCs w:val="28"/>
-          <w:lang w:val="vi-VN"/>
-        </w:rPr>
-        <w:t xml:space="preserve">đặc biệt là </w:t>
-      </w:r>
-      <w:proofErr w:type="spellStart"/>
-      <w:r>
-        <w:rPr>
-          <w:rFonts w:ascii="Times New Roman" w:hAnsi="Times New Roman"/>
-          <w:sz w:val="28"/>
-          <w:szCs w:val="28"/>
-          <w:lang w:val="vi-VN"/>
-        </w:rPr>
-        <w:t>Use</w:t>
-      </w:r>
-      <w:proofErr w:type="spellEnd"/>
-      <w:r>
-        <w:rPr>
-          <w:rFonts w:ascii="Times New Roman" w:hAnsi="Times New Roman"/>
-          <w:sz w:val="28"/>
-          <w:szCs w:val="28"/>
-          <w:lang w:val="vi-VN"/>
-        </w:rPr>
-        <w:t xml:space="preserve"> </w:t>
-      </w:r>
-      <w:proofErr w:type="spellStart"/>
-      <w:r>
-        <w:rPr>
-          <w:rFonts w:ascii="Times New Roman" w:hAnsi="Times New Roman"/>
-          <w:sz w:val="28"/>
-          <w:szCs w:val="28"/>
-          <w:lang w:val="vi-VN"/>
-        </w:rPr>
-        <w:t>Case</w:t>
-      </w:r>
-      <w:proofErr w:type="spellEnd"/>
-      <w:r>
-        <w:rPr>
-          <w:rFonts w:ascii="Times New Roman" w:hAnsi="Times New Roman"/>
-          <w:sz w:val="28"/>
-          <w:szCs w:val="28"/>
-          <w:lang w:val="vi-VN"/>
-        </w:rPr>
-        <w:t xml:space="preserve">, </w:t>
-      </w:r>
-    </w:p>
-    <w:p>
-      <w:pPr>
-        <w:spacing w:before="120" w:after="120" w:line="360" w:lineRule="auto"/>
-        <w:ind w:firstLine="567"/>
-        <w:jc w:val="both"/>
-        <w:rPr>
-          <w:rFonts w:ascii="Times New Roman" w:hAnsi="Times New Roman"/>
-          <w:sz w:val="28"/>
-          <w:szCs w:val="28"/>
-          <w:lang w:val="vi-VN"/>
-        </w:rPr>
-      </w:pPr>
-      <w:r>
-        <w:rPr>
-          <w:rFonts w:ascii="Times New Roman" w:hAnsi="Times New Roman"/>
-          <w:sz w:val="28"/>
-          <w:szCs w:val="28"/>
-          <w:lang w:val="vi-VN"/>
-        </w:rPr>
-        <w:t xml:space="preserve">ERD, </w:t>
-      </w:r>
-    </w:p>
-    <w:p>
-      <w:pPr>
-        <w:spacing w:before="120" w:after="120" w:line="360" w:lineRule="auto"/>
-        <w:ind w:firstLine="567"/>
-        <w:jc w:val="both"/>
-        <w:rPr>
-          <w:rFonts w:ascii="Times New Roman" w:hAnsi="Times New Roman"/>
-          <w:sz w:val="28"/>
-          <w:szCs w:val="28"/>
-          <w:lang w:val="vi-VN"/>
-        </w:rPr>
-      </w:pPr>
-      <w:r>
-        <w:rPr>
-          <w:rFonts w:ascii="Times New Roman" w:hAnsi="Times New Roman"/>
-          <w:sz w:val="28"/>
-          <w:szCs w:val="28"/>
-          <w:lang w:val="vi-VN"/>
-        </w:rPr>
-        <w:t xml:space="preserve">biểu đồ trạng thái yêu cầu </w:t>
-      </w:r>
-    </w:p>
-    <w:p>
-      <w:pPr>
-        <w:spacing w:before="120" w:after="120" w:line="360" w:lineRule="auto"/>
-        <w:ind w:firstLine="567"/>
-        <w:jc w:val="both"/>
-        <w:rPr>
-          <w:rFonts w:ascii="Times New Roman" w:hAnsi="Times New Roman"/>
-          <w:sz w:val="28"/>
-          <w:szCs w:val="28"/>
-          <w:lang w:val="vi-VN"/>
-        </w:rPr>
-      </w:pPr>
-      <w:r>
-        <w:rPr>
-          <w:rFonts w:ascii="Times New Roman" w:hAnsi="Times New Roman"/>
-          <w:sz w:val="28"/>
-          <w:szCs w:val="28"/>
-          <w:lang w:val="vi-VN"/>
-        </w:rPr>
-        <w:t>biểu đồ triển khai.</w:t>
-      </w:r>
-    </w:p>
-    <w:p>
-      <w:pPr>
-        <w:spacing w:before="120" w:after="120" w:line="360" w:lineRule="auto"/>
-        <w:ind w:firstLine="567"/>
-        <w:jc w:val="both"/>
-        <w:rPr>
-          <w:rFonts w:ascii="Times New Roman" w:hAnsi="Times New Roman"/>
-          <w:sz w:val="28"/>
-          <w:szCs w:val="28"/>
-          <w:lang w:val="vi-VN"/>
-        </w:rPr>
-      </w:pPr>
-      <w:r>
-        <w:rPr>
-          <w:rFonts w:ascii="Times New Roman" w:hAnsi="Times New Roman"/>
-          <w:sz w:val="28"/>
-          <w:szCs w:val="28"/>
-          <w:lang w:val="vi-VN"/>
-        </w:rPr>
-        <w:t>Kết luận chương</w:t>
-      </w:r>
-    </w:p>
-    <w:p>
-      <w:pPr>
-        <w:spacing w:before="120" w:after="120" w:line="360" w:lineRule="auto"/>
+          <w:kern w:val="2"/>
+          <w:lang w:val="vi-VN" w:eastAsia="vi-VN"/>
+          <w14:ligatures w14:val="standardContextual"/>
+        </w:rPr>
+      </w:pPr>
+      <w:hyperlink w:anchor="_Toc242195407" w:history="1">
+        <w:r>
+          <w:rPr>
+            <w:rStyle w:val="Siuktni"/>
+            <w:rFonts w:ascii="Times New Roman" w:hAnsi="Times New Roman"/>
+            <w:iCs/>
+            <w:color w:val="auto"/>
+            <w:szCs w:val="26"/>
+            <w:u w:val="none"/>
+            <w:lang w:val="vi-VN"/>
+          </w:rPr>
+          <w:t>2</w:t>
+        </w:r>
+        <w:r>
+          <w:rPr>
+            <w:rStyle w:val="Siuktni"/>
+            <w:rFonts w:ascii="Times New Roman" w:hAnsi="Times New Roman" w:cs="Times New Roman"/>
+            <w:iCs/>
+            <w:color w:val="auto"/>
+            <w:sz w:val="26"/>
+            <w:szCs w:val="26"/>
+            <w:u w:val="none"/>
+            <w:lang w:val="vi-VN"/>
+          </w:rPr>
+          <w:t>.1.</w:t>
+        </w:r>
+        <w:r>
+          <w:rPr>
+            <w:rStyle w:val="Siuktni"/>
+            <w:rFonts w:ascii="Times New Roman" w:hAnsi="Times New Roman"/>
+            <w:iCs/>
+            <w:color w:val="auto"/>
+            <w:szCs w:val="26"/>
+            <w:u w:val="none"/>
+            <w:lang w:val="vi-VN"/>
+          </w:rPr>
+          <w:t>3</w:t>
+        </w:r>
+        <w:r>
+          <w:rPr>
+            <w:rStyle w:val="Siuktni"/>
+            <w:rFonts w:ascii="Times New Roman" w:hAnsi="Times New Roman" w:cs="Times New Roman"/>
+            <w:iCs/>
+            <w:color w:val="auto"/>
+            <w:sz w:val="26"/>
+            <w:szCs w:val="26"/>
+            <w:u w:val="none"/>
+            <w:lang w:val="vi-VN"/>
+          </w:rPr>
+          <w:t xml:space="preserve"> Đánh giá và lựa chọn kiến trúc, công nghệ phù hợp</w:t>
+        </w:r>
+      </w:hyperlink>
+    </w:p>
+    <w:p>
+      <w:pPr>
+        <w:pStyle w:val="u2"/>
+        <w:spacing w:line="360" w:lineRule="auto"/>
+        <w:rPr>
+          <w:rFonts w:ascii="Times New Roman" w:eastAsiaTheme="minorEastAsia" w:hAnsi="Times New Roman" w:cs="Times New Roman"/>
+          <w:kern w:val="2"/>
+          <w:lang w:val="vi-VN" w:eastAsia="vi-VN"/>
+          <w14:ligatures w14:val="standardContextual"/>
+        </w:rPr>
+      </w:pPr>
+      <w:hyperlink w:anchor="_Toc242195408" w:history="1">
+        <w:r>
+          <w:rPr>
+            <w:rStyle w:val="Siuktni"/>
+            <w:rFonts w:ascii="Times New Roman" w:hAnsi="Times New Roman"/>
+            <w:iCs/>
+            <w:color w:val="auto"/>
+            <w:u w:val="none"/>
+            <w:lang w:val="vi-VN"/>
+          </w:rPr>
+          <w:t>2</w:t>
+        </w:r>
+        <w:r>
+          <w:rPr>
+            <w:rStyle w:val="Siuktni"/>
+            <w:rFonts w:ascii="Times New Roman" w:hAnsi="Times New Roman" w:cs="Times New Roman"/>
+            <w:iCs/>
+            <w:color w:val="auto"/>
+            <w:u w:val="none"/>
+            <w:lang w:val="vi-VN"/>
+          </w:rPr>
+          <w:t>.2. Phân tích hệ thống</w:t>
+        </w:r>
+      </w:hyperlink>
+    </w:p>
+    <w:p>
+      <w:pPr>
+        <w:pStyle w:val="u3"/>
+        <w:spacing w:line="360" w:lineRule="auto"/>
+        <w:rPr>
+          <w:rFonts w:ascii="Times New Roman" w:eastAsiaTheme="minorEastAsia" w:hAnsi="Times New Roman" w:cs="Times New Roman"/>
+          <w:b/>
+          <w:kern w:val="2"/>
+          <w:lang w:val="vi-VN" w:eastAsia="vi-VN"/>
+          <w14:ligatures w14:val="standardContextual"/>
+        </w:rPr>
+      </w:pPr>
+      <w:hyperlink w:anchor="_Toc242195409" w:history="1">
+        <w:r>
+          <w:rPr>
+            <w:rStyle w:val="Siuktni"/>
+            <w:rFonts w:ascii="Times New Roman" w:hAnsi="Times New Roman"/>
+            <w:iCs/>
+            <w:color w:val="auto"/>
+            <w:szCs w:val="26"/>
+            <w:u w:val="none"/>
+            <w:lang w:val="vi-VN"/>
+          </w:rPr>
+          <w:t>2</w:t>
+        </w:r>
+        <w:r>
+          <w:rPr>
+            <w:rStyle w:val="Siuktni"/>
+            <w:rFonts w:ascii="Times New Roman" w:hAnsi="Times New Roman" w:cs="Times New Roman"/>
+            <w:iCs/>
+            <w:color w:val="auto"/>
+            <w:sz w:val="26"/>
+            <w:szCs w:val="26"/>
+            <w:u w:val="none"/>
+            <w:lang w:val="vi-VN"/>
+          </w:rPr>
+          <w:t xml:space="preserve">.2.1 Yêu cầu chức năng cho người </w:t>
+        </w:r>
+        <w:r>
+          <w:rPr>
+            <w:rStyle w:val="Siuktni"/>
+            <w:rFonts w:ascii="Times New Roman" w:hAnsi="Times New Roman" w:cs="Times New Roman"/>
+            <w:iCs/>
+            <w:color w:val="auto"/>
+            <w:szCs w:val="26"/>
+            <w:u w:val="none"/>
+            <w:lang w:val="vi-VN"/>
+          </w:rPr>
+          <w:t>dùng</w:t>
+        </w:r>
+      </w:hyperlink>
+    </w:p>
+    <w:p>
+      <w:pPr>
+        <w:pStyle w:val="u3"/>
+        <w:spacing w:line="360" w:lineRule="auto"/>
+        <w:rPr>
+          <w:rFonts w:ascii="Times New Roman" w:eastAsiaTheme="minorEastAsia" w:hAnsi="Times New Roman" w:cs="Times New Roman"/>
+          <w:b/>
+          <w:kern w:val="2"/>
+          <w:lang w:val="vi-VN" w:eastAsia="vi-VN"/>
+          <w14:ligatures w14:val="standardContextual"/>
+        </w:rPr>
+      </w:pPr>
+      <w:hyperlink w:anchor="_Toc242195410" w:history="1">
+        <w:r>
+          <w:rPr>
+            <w:rStyle w:val="Siuktni"/>
+            <w:rFonts w:ascii="Times New Roman" w:hAnsi="Times New Roman"/>
+            <w:iCs/>
+            <w:color w:val="auto"/>
+            <w:szCs w:val="26"/>
+            <w:u w:val="none"/>
+            <w:lang w:val="vi-VN"/>
+          </w:rPr>
+          <w:t>2</w:t>
+        </w:r>
+        <w:r>
+          <w:rPr>
+            <w:rStyle w:val="Siuktni"/>
+            <w:rFonts w:ascii="Times New Roman" w:hAnsi="Times New Roman" w:cs="Times New Roman"/>
+            <w:iCs/>
+            <w:color w:val="auto"/>
+            <w:sz w:val="26"/>
+            <w:szCs w:val="26"/>
+            <w:u w:val="none"/>
+            <w:lang w:val="vi-VN"/>
+          </w:rPr>
+          <w:t>.2.2 Yêu cầu chức năng cho quản trị viên</w:t>
+        </w:r>
+      </w:hyperlink>
+    </w:p>
+    <w:p>
+      <w:pPr>
+        <w:pStyle w:val="u3"/>
+        <w:spacing w:line="360" w:lineRule="auto"/>
+        <w:rPr>
+          <w:rFonts w:ascii="Times New Roman" w:eastAsiaTheme="minorEastAsia" w:hAnsi="Times New Roman" w:cs="Times New Roman"/>
+          <w:b/>
+          <w:kern w:val="2"/>
+          <w:lang w:val="vi-VN" w:eastAsia="vi-VN"/>
+          <w14:ligatures w14:val="standardContextual"/>
+        </w:rPr>
+      </w:pPr>
+      <w:hyperlink w:anchor="_Toc242195411" w:history="1">
+        <w:r>
+          <w:rPr>
+            <w:rStyle w:val="Siuktni"/>
+            <w:rFonts w:ascii="Times New Roman" w:hAnsi="Times New Roman"/>
+            <w:iCs/>
+            <w:color w:val="auto"/>
+            <w:szCs w:val="26"/>
+            <w:u w:val="none"/>
+            <w:lang w:val="vi-VN"/>
+          </w:rPr>
+          <w:t>2</w:t>
+        </w:r>
+        <w:r>
+          <w:rPr>
+            <w:rStyle w:val="Siuktni"/>
+            <w:rFonts w:ascii="Times New Roman" w:hAnsi="Times New Roman" w:cs="Times New Roman"/>
+            <w:iCs/>
+            <w:color w:val="auto"/>
+            <w:sz w:val="26"/>
+            <w:szCs w:val="26"/>
+            <w:u w:val="none"/>
+            <w:lang w:val="vi-VN"/>
+          </w:rPr>
+          <w:t>.2.3 Yêu cầu phi chức năng</w:t>
+        </w:r>
+      </w:hyperlink>
+    </w:p>
+    <w:p>
+      <w:pPr>
+        <w:pStyle w:val="u3"/>
+        <w:spacing w:line="360" w:lineRule="auto"/>
+        <w:rPr>
+          <w:rFonts w:ascii="Times New Roman" w:eastAsiaTheme="minorEastAsia" w:hAnsi="Times New Roman" w:cs="Times New Roman"/>
+          <w:b/>
+          <w:kern w:val="2"/>
+          <w:lang w:val="vi-VN" w:eastAsia="vi-VN"/>
+          <w14:ligatures w14:val="standardContextual"/>
+        </w:rPr>
+      </w:pPr>
+      <w:hyperlink w:anchor="_Toc242195412" w:history="1">
+        <w:r>
+          <w:rPr>
+            <w:rStyle w:val="Siuktni"/>
+            <w:rFonts w:ascii="Times New Roman" w:hAnsi="Times New Roman"/>
+            <w:iCs/>
+            <w:color w:val="auto"/>
+            <w:szCs w:val="26"/>
+            <w:u w:val="none"/>
+            <w:lang w:val="vi-VN"/>
+          </w:rPr>
+          <w:t>2</w:t>
+        </w:r>
+        <w:r>
+          <w:rPr>
+            <w:rStyle w:val="Siuktni"/>
+            <w:rFonts w:ascii="Times New Roman" w:hAnsi="Times New Roman" w:cs="Times New Roman"/>
+            <w:iCs/>
+            <w:color w:val="auto"/>
+            <w:sz w:val="26"/>
+            <w:szCs w:val="26"/>
+            <w:u w:val="none"/>
+            <w:lang w:val="vi-VN"/>
+          </w:rPr>
+          <w:t>.2.4 Tác nhân của hệ thống</w:t>
+        </w:r>
+      </w:hyperlink>
+    </w:p>
+    <w:p>
+      <w:pPr>
+        <w:pStyle w:val="u3"/>
+        <w:spacing w:line="360" w:lineRule="auto"/>
+        <w:rPr>
+          <w:rFonts w:ascii="Times New Roman" w:eastAsiaTheme="minorEastAsia" w:hAnsi="Times New Roman" w:cs="Times New Roman"/>
+          <w:b/>
+          <w:kern w:val="2"/>
+          <w:lang w:val="vi-VN" w:eastAsia="vi-VN"/>
+          <w14:ligatures w14:val="standardContextual"/>
+        </w:rPr>
+      </w:pPr>
+      <w:hyperlink w:anchor="_Toc242195413" w:history="1">
+        <w:r>
+          <w:rPr>
+            <w:rStyle w:val="Siuktni"/>
+            <w:rFonts w:ascii="Times New Roman" w:hAnsi="Times New Roman"/>
+            <w:iCs/>
+            <w:color w:val="auto"/>
+            <w:szCs w:val="26"/>
+            <w:u w:val="none"/>
+            <w:lang w:val="vi-VN"/>
+          </w:rPr>
+          <w:t>2</w:t>
+        </w:r>
+        <w:r>
+          <w:rPr>
+            <w:rStyle w:val="Siuktni"/>
+            <w:rFonts w:ascii="Times New Roman" w:hAnsi="Times New Roman" w:cs="Times New Roman"/>
+            <w:iCs/>
+            <w:color w:val="auto"/>
+            <w:sz w:val="26"/>
+            <w:szCs w:val="26"/>
+            <w:u w:val="none"/>
+            <w:lang w:val="vi-VN"/>
+          </w:rPr>
+          <w:t xml:space="preserve">.2.5 Xác định các </w:t>
+        </w:r>
+        <w:proofErr w:type="spellStart"/>
+        <w:r>
+          <w:rPr>
+            <w:rStyle w:val="Siuktni"/>
+            <w:rFonts w:ascii="Times New Roman" w:hAnsi="Times New Roman" w:cs="Times New Roman"/>
+            <w:iCs/>
+            <w:color w:val="auto"/>
+            <w:sz w:val="26"/>
+            <w:szCs w:val="26"/>
+            <w:u w:val="none"/>
+            <w:lang w:val="vi-VN"/>
+          </w:rPr>
+          <w:t>UseCase</w:t>
+        </w:r>
+        <w:proofErr w:type="spellEnd"/>
+      </w:hyperlink>
+    </w:p>
+    <w:p>
+      <w:pPr>
+        <w:pStyle w:val="u3"/>
+        <w:spacing w:line="360" w:lineRule="auto"/>
+        <w:rPr>
+          <w:rFonts w:ascii="Times New Roman" w:eastAsiaTheme="minorEastAsia" w:hAnsi="Times New Roman" w:cs="Times New Roman"/>
+          <w:b/>
+          <w:kern w:val="2"/>
+          <w:lang w:val="vi-VN" w:eastAsia="vi-VN"/>
+          <w14:ligatures w14:val="standardContextual"/>
+        </w:rPr>
+      </w:pPr>
+      <w:hyperlink w:anchor="_Toc242195414" w:history="1">
+        <w:r>
+          <w:rPr>
+            <w:rStyle w:val="Siuktni"/>
+            <w:rFonts w:ascii="Times New Roman" w:hAnsi="Times New Roman"/>
+            <w:iCs/>
+            <w:color w:val="auto"/>
+            <w:szCs w:val="26"/>
+            <w:u w:val="none"/>
+            <w:lang w:val="vi-VN"/>
+          </w:rPr>
+          <w:t>2</w:t>
+        </w:r>
+        <w:r>
+          <w:rPr>
+            <w:rStyle w:val="Siuktni"/>
+            <w:rFonts w:ascii="Times New Roman" w:hAnsi="Times New Roman" w:cs="Times New Roman"/>
+            <w:iCs/>
+            <w:color w:val="auto"/>
+            <w:sz w:val="26"/>
+            <w:szCs w:val="26"/>
+            <w:u w:val="none"/>
+            <w:lang w:val="vi-VN"/>
+          </w:rPr>
+          <w:t xml:space="preserve">.2.5 Biểu đồ </w:t>
+        </w:r>
+        <w:proofErr w:type="spellStart"/>
+        <w:r>
+          <w:rPr>
+            <w:rStyle w:val="Siuktni"/>
+            <w:rFonts w:ascii="Times New Roman" w:hAnsi="Times New Roman" w:cs="Times New Roman"/>
+            <w:iCs/>
+            <w:color w:val="auto"/>
+            <w:sz w:val="26"/>
+            <w:szCs w:val="26"/>
+            <w:u w:val="none"/>
+            <w:lang w:val="vi-VN"/>
+          </w:rPr>
+          <w:t>UseCase</w:t>
+        </w:r>
+        <w:proofErr w:type="spellEnd"/>
+        <w:r>
+          <w:rPr>
+            <w:rStyle w:val="Siuktni"/>
+            <w:rFonts w:ascii="Times New Roman" w:hAnsi="Times New Roman" w:cs="Times New Roman"/>
+            <w:iCs/>
+            <w:color w:val="auto"/>
+            <w:sz w:val="26"/>
+            <w:szCs w:val="26"/>
+            <w:u w:val="none"/>
+            <w:lang w:val="vi-VN"/>
+          </w:rPr>
+          <w:t xml:space="preserve"> phân cấp chức năng</w:t>
+        </w:r>
+      </w:hyperlink>
+    </w:p>
+    <w:p>
+      <w:pPr>
+        <w:pStyle w:val="u3"/>
+        <w:spacing w:line="360" w:lineRule="auto"/>
+        <w:rPr>
+          <w:rFonts w:ascii="Times New Roman" w:eastAsiaTheme="minorEastAsia" w:hAnsi="Times New Roman" w:cs="Times New Roman"/>
+          <w:b/>
+          <w:kern w:val="2"/>
+          <w:lang w:val="vi-VN" w:eastAsia="vi-VN"/>
+          <w14:ligatures w14:val="standardContextual"/>
+        </w:rPr>
+      </w:pPr>
+      <w:hyperlink w:anchor="_Toc242195415" w:history="1">
+        <w:r>
+          <w:rPr>
+            <w:rStyle w:val="Siuktni"/>
+            <w:rFonts w:ascii="Times New Roman" w:hAnsi="Times New Roman"/>
+            <w:iCs/>
+            <w:color w:val="auto"/>
+            <w:szCs w:val="26"/>
+            <w:u w:val="none"/>
+            <w:lang w:val="vi-VN"/>
+          </w:rPr>
+          <w:t>2</w:t>
+        </w:r>
+        <w:r>
+          <w:rPr>
+            <w:rStyle w:val="Siuktni"/>
+            <w:rFonts w:ascii="Times New Roman" w:hAnsi="Times New Roman" w:cs="Times New Roman"/>
+            <w:iCs/>
+            <w:color w:val="auto"/>
+            <w:sz w:val="26"/>
+            <w:szCs w:val="26"/>
+            <w:u w:val="none"/>
+            <w:lang w:val="vi-VN"/>
+          </w:rPr>
+          <w:t xml:space="preserve">.2.6 Biểu đồ </w:t>
+        </w:r>
+        <w:proofErr w:type="spellStart"/>
+        <w:r>
+          <w:rPr>
+            <w:rStyle w:val="Siuktni"/>
+            <w:rFonts w:ascii="Times New Roman" w:hAnsi="Times New Roman" w:cs="Times New Roman"/>
+            <w:iCs/>
+            <w:color w:val="auto"/>
+            <w:sz w:val="26"/>
+            <w:szCs w:val="26"/>
+            <w:u w:val="none"/>
+            <w:lang w:val="vi-VN"/>
+          </w:rPr>
+          <w:t>UseCase</w:t>
+        </w:r>
+        <w:proofErr w:type="spellEnd"/>
+        <w:r>
+          <w:rPr>
+            <w:rStyle w:val="Siuktni"/>
+            <w:rFonts w:ascii="Times New Roman" w:hAnsi="Times New Roman" w:cs="Times New Roman"/>
+            <w:iCs/>
+            <w:color w:val="auto"/>
+            <w:sz w:val="26"/>
+            <w:szCs w:val="26"/>
+            <w:u w:val="none"/>
+            <w:lang w:val="vi-VN"/>
+          </w:rPr>
+          <w:t xml:space="preserve"> tổng quát</w:t>
+        </w:r>
+      </w:hyperlink>
+    </w:p>
+    <w:p>
+      <w:pPr>
+        <w:pStyle w:val="u3"/>
+        <w:spacing w:line="360" w:lineRule="auto"/>
+        <w:rPr>
+          <w:lang w:val="vi-VN"/>
+        </w:rPr>
+      </w:pPr>
+      <w:hyperlink w:anchor="_Toc242195416" w:history="1">
+        <w:r>
+          <w:rPr>
+            <w:rStyle w:val="Siuktni"/>
+            <w:rFonts w:ascii="Times New Roman" w:hAnsi="Times New Roman"/>
+            <w:iCs/>
+            <w:color w:val="auto"/>
+            <w:szCs w:val="26"/>
+            <w:u w:val="none"/>
+            <w:lang w:val="vi-VN"/>
+          </w:rPr>
+          <w:t>2</w:t>
+        </w:r>
+        <w:r>
+          <w:rPr>
+            <w:rStyle w:val="Siuktni"/>
+            <w:rFonts w:ascii="Times New Roman" w:hAnsi="Times New Roman" w:cs="Times New Roman"/>
+            <w:iCs/>
+            <w:color w:val="auto"/>
+            <w:sz w:val="26"/>
+            <w:szCs w:val="26"/>
+            <w:u w:val="none"/>
+            <w:lang w:val="vi-VN"/>
+          </w:rPr>
+          <w:t xml:space="preserve">.2.7 Biểu đồ </w:t>
+        </w:r>
+        <w:proofErr w:type="spellStart"/>
+        <w:r>
+          <w:rPr>
+            <w:rStyle w:val="Siuktni"/>
+            <w:rFonts w:ascii="Times New Roman" w:hAnsi="Times New Roman" w:cs="Times New Roman"/>
+            <w:iCs/>
+            <w:color w:val="auto"/>
+            <w:sz w:val="26"/>
+            <w:szCs w:val="26"/>
+            <w:u w:val="none"/>
+            <w:lang w:val="vi-VN"/>
+          </w:rPr>
+          <w:t>use</w:t>
+        </w:r>
+        <w:proofErr w:type="spellEnd"/>
+        <w:r>
+          <w:rPr>
+            <w:rStyle w:val="Siuktni"/>
+            <w:rFonts w:ascii="Times New Roman" w:hAnsi="Times New Roman" w:cs="Times New Roman"/>
+            <w:iCs/>
+            <w:color w:val="auto"/>
+            <w:sz w:val="26"/>
+            <w:szCs w:val="26"/>
+            <w:u w:val="none"/>
+            <w:lang w:val="vi-VN"/>
+          </w:rPr>
+          <w:t xml:space="preserve"> </w:t>
+        </w:r>
+        <w:proofErr w:type="spellStart"/>
+        <w:r>
+          <w:rPr>
+            <w:rStyle w:val="Siuktni"/>
+            <w:rFonts w:ascii="Times New Roman" w:hAnsi="Times New Roman" w:cs="Times New Roman"/>
+            <w:iCs/>
+            <w:color w:val="auto"/>
+            <w:sz w:val="26"/>
+            <w:szCs w:val="26"/>
+            <w:u w:val="none"/>
+            <w:lang w:val="vi-VN"/>
+          </w:rPr>
+          <w:t>case</w:t>
+        </w:r>
+        <w:proofErr w:type="spellEnd"/>
+        <w:r>
+          <w:rPr>
+            <w:rStyle w:val="Siuktni"/>
+            <w:rFonts w:ascii="Times New Roman" w:hAnsi="Times New Roman" w:cs="Times New Roman"/>
+            <w:iCs/>
+            <w:color w:val="auto"/>
+            <w:sz w:val="26"/>
+            <w:szCs w:val="26"/>
+            <w:u w:val="none"/>
+            <w:lang w:val="vi-VN"/>
+          </w:rPr>
+          <w:t xml:space="preserve"> phân rã chức năng</w:t>
+        </w:r>
+        <w:r>
+          <w:rPr>
+            <w:rFonts w:ascii="Times New Roman" w:hAnsi="Times New Roman" w:cs="Times New Roman"/>
+            <w:webHidden/>
+            <w:lang w:val="vi-VN"/>
+          </w:rPr>
+          <w:tab/>
+        </w:r>
+      </w:hyperlink>
+    </w:p>
+    <w:p>
+      <w:pPr>
+        <w:pStyle w:val="u2"/>
+        <w:spacing w:line="360" w:lineRule="auto"/>
+        <w:rPr>
+          <w:rFonts w:ascii="Times New Roman" w:hAnsi="Times New Roman" w:cs="Times New Roman"/>
+          <w:lang w:val="vi-VN"/>
+        </w:rPr>
+      </w:pPr>
+      <w:r>
+        <w:rPr>
+          <w:rFonts w:ascii="Times New Roman" w:hAnsi="Times New Roman" w:cs="Times New Roman"/>
+          <w:color w:val="auto"/>
+          <w:lang w:val="vi-VN"/>
+        </w:rPr>
+        <w:t>2.3 Thiết kế hệ thống</w:t>
+      </w:r>
+      <w:r>
+        <w:rPr>
+          <w:rFonts w:ascii="Times New Roman" w:hAnsi="Times New Roman" w:cs="Times New Roman"/>
+          <w:lang w:val="vi-VN"/>
+        </w:rPr>
+        <w:t xml:space="preserve"> </w:t>
+      </w:r>
+    </w:p>
+    <w:p>
+      <w:pPr>
+        <w:pStyle w:val="u3"/>
+        <w:spacing w:line="360" w:lineRule="auto"/>
+        <w:rPr>
+          <w:rFonts w:ascii="Times New Roman" w:eastAsiaTheme="minorEastAsia" w:hAnsi="Times New Roman" w:cs="Times New Roman"/>
+          <w:b/>
+          <w:kern w:val="2"/>
+          <w:lang w:val="vi-VN" w:eastAsia="vi-VN"/>
+          <w14:ligatures w14:val="standardContextual"/>
+        </w:rPr>
+      </w:pPr>
+      <w:hyperlink w:anchor="_Toc242195417" w:history="1">
+        <w:r>
+          <w:rPr>
+            <w:rStyle w:val="Siuktni"/>
+            <w:rFonts w:ascii="Times New Roman" w:hAnsi="Times New Roman"/>
+            <w:iCs/>
+            <w:color w:val="auto"/>
+            <w:szCs w:val="26"/>
+            <w:u w:val="none"/>
+            <w:lang w:val="vi-VN"/>
+          </w:rPr>
+          <w:t>2</w:t>
+        </w:r>
+        <w:r>
+          <w:rPr>
+            <w:rStyle w:val="Siuktni"/>
+            <w:rFonts w:ascii="Times New Roman" w:hAnsi="Times New Roman" w:cs="Times New Roman"/>
+            <w:iCs/>
+            <w:color w:val="auto"/>
+            <w:sz w:val="26"/>
+            <w:szCs w:val="26"/>
+            <w:u w:val="none"/>
+            <w:lang w:val="vi-VN"/>
+          </w:rPr>
+          <w:t>.3.1 Biểu đồ hoạt động</w:t>
+        </w:r>
+      </w:hyperlink>
+    </w:p>
+    <w:p>
+      <w:pPr>
+        <w:pStyle w:val="u3"/>
+        <w:spacing w:line="360" w:lineRule="auto"/>
+        <w:rPr>
+          <w:rFonts w:ascii="Times New Roman" w:eastAsiaTheme="minorEastAsia" w:hAnsi="Times New Roman" w:cs="Times New Roman"/>
+          <w:b/>
+          <w:kern w:val="2"/>
+          <w:lang w:val="vi-VN" w:eastAsia="vi-VN"/>
+          <w14:ligatures w14:val="standardContextual"/>
+        </w:rPr>
+      </w:pPr>
+      <w:hyperlink w:anchor="_Toc242195418" w:history="1">
+        <w:r>
+          <w:rPr>
+            <w:rStyle w:val="Siuktni"/>
+            <w:rFonts w:ascii="Times New Roman" w:hAnsi="Times New Roman"/>
+            <w:iCs/>
+            <w:color w:val="auto"/>
+            <w:szCs w:val="26"/>
+            <w:u w:val="none"/>
+            <w:lang w:val="vi-VN"/>
+          </w:rPr>
+          <w:t>2</w:t>
+        </w:r>
+        <w:r>
+          <w:rPr>
+            <w:rStyle w:val="Siuktni"/>
+            <w:rFonts w:ascii="Times New Roman" w:hAnsi="Times New Roman" w:cs="Times New Roman"/>
+            <w:iCs/>
+            <w:color w:val="auto"/>
+            <w:sz w:val="26"/>
+            <w:szCs w:val="26"/>
+            <w:u w:val="none"/>
+            <w:lang w:val="vi-VN"/>
+          </w:rPr>
+          <w:t>.3.2 Biểu đồ tuần tự</w:t>
+        </w:r>
+      </w:hyperlink>
+    </w:p>
+    <w:p>
+      <w:pPr>
+        <w:pStyle w:val="u3"/>
+        <w:spacing w:line="360" w:lineRule="auto"/>
+        <w:rPr>
+          <w:rFonts w:ascii="Times New Roman" w:eastAsiaTheme="minorEastAsia" w:hAnsi="Times New Roman" w:cs="Times New Roman"/>
+          <w:b/>
+          <w:kern w:val="2"/>
+          <w:lang w:val="vi-VN" w:eastAsia="vi-VN"/>
+          <w14:ligatures w14:val="standardContextual"/>
+        </w:rPr>
+      </w:pPr>
+      <w:hyperlink w:anchor="_Toc242195419" w:history="1">
+        <w:r>
+          <w:rPr>
+            <w:rStyle w:val="Siuktni"/>
+            <w:rFonts w:ascii="Times New Roman" w:hAnsi="Times New Roman"/>
+            <w:iCs/>
+            <w:color w:val="auto"/>
+            <w:szCs w:val="26"/>
+            <w:u w:val="none"/>
+            <w:lang w:val="vi-VN"/>
+          </w:rPr>
+          <w:t>2</w:t>
+        </w:r>
+        <w:r>
+          <w:rPr>
+            <w:rStyle w:val="Siuktni"/>
+            <w:rFonts w:ascii="Times New Roman" w:hAnsi="Times New Roman" w:cs="Times New Roman"/>
+            <w:iCs/>
+            <w:color w:val="auto"/>
+            <w:sz w:val="26"/>
+            <w:szCs w:val="26"/>
+            <w:u w:val="none"/>
+            <w:lang w:val="vi-VN"/>
+          </w:rPr>
+          <w:t>.3.3 Biểu đồ lớp</w:t>
+        </w:r>
+      </w:hyperlink>
+    </w:p>
+    <w:p>
+      <w:pPr>
+        <w:pStyle w:val="u3"/>
+        <w:spacing w:line="360" w:lineRule="auto"/>
+        <w:rPr>
+          <w:rFonts w:ascii="Times New Roman" w:eastAsiaTheme="minorEastAsia" w:hAnsi="Times New Roman" w:cs="Times New Roman"/>
+          <w:b/>
+          <w:kern w:val="2"/>
+          <w:lang w:val="vi-VN" w:eastAsia="vi-VN"/>
+          <w14:ligatures w14:val="standardContextual"/>
+        </w:rPr>
+      </w:pPr>
+      <w:hyperlink w:anchor="_Toc242195420" w:history="1">
+        <w:r>
+          <w:rPr>
+            <w:rStyle w:val="Siuktni"/>
+            <w:rFonts w:ascii="Times New Roman" w:hAnsi="Times New Roman"/>
+            <w:iCs/>
+            <w:color w:val="auto"/>
+            <w:szCs w:val="26"/>
+            <w:u w:val="none"/>
+            <w:lang w:val="vi-VN"/>
+          </w:rPr>
+          <w:t>2</w:t>
+        </w:r>
+        <w:r>
+          <w:rPr>
+            <w:rStyle w:val="Siuktni"/>
+            <w:rFonts w:ascii="Times New Roman" w:hAnsi="Times New Roman" w:cs="Times New Roman"/>
+            <w:iCs/>
+            <w:color w:val="auto"/>
+            <w:sz w:val="26"/>
+            <w:szCs w:val="26"/>
+            <w:u w:val="none"/>
+            <w:lang w:val="vi-VN"/>
+          </w:rPr>
+          <w:t>.3.4 Biểu đồ trạng thái</w:t>
+        </w:r>
+      </w:hyperlink>
+    </w:p>
+    <w:p>
+      <w:pPr>
+        <w:pStyle w:val="u3"/>
+        <w:spacing w:line="360" w:lineRule="auto"/>
+        <w:rPr>
+          <w:rFonts w:ascii="Times New Roman" w:eastAsiaTheme="minorEastAsia" w:hAnsi="Times New Roman" w:cs="Times New Roman"/>
+          <w:b/>
+          <w:kern w:val="2"/>
+          <w:lang w:val="vi-VN" w:eastAsia="vi-VN"/>
+          <w14:ligatures w14:val="standardContextual"/>
+        </w:rPr>
+      </w:pPr>
+      <w:hyperlink w:anchor="_Toc242195421" w:history="1">
+        <w:r>
+          <w:rPr>
+            <w:rStyle w:val="Siuktni"/>
+            <w:rFonts w:ascii="Times New Roman" w:hAnsi="Times New Roman"/>
+            <w:iCs/>
+            <w:color w:val="auto"/>
+            <w:szCs w:val="26"/>
+            <w:u w:val="none"/>
+            <w:lang w:val="vi-VN"/>
+          </w:rPr>
+          <w:t>2</w:t>
+        </w:r>
+        <w:r>
+          <w:rPr>
+            <w:rStyle w:val="Siuktni"/>
+            <w:rFonts w:ascii="Times New Roman" w:hAnsi="Times New Roman" w:cs="Times New Roman"/>
+            <w:iCs/>
+            <w:color w:val="auto"/>
+            <w:sz w:val="26"/>
+            <w:szCs w:val="26"/>
+            <w:u w:val="none"/>
+            <w:lang w:val="vi-VN"/>
+          </w:rPr>
+          <w:t>.3.5 Biểu đồ thành phần</w:t>
+        </w:r>
+      </w:hyperlink>
+    </w:p>
+    <w:p>
+      <w:pPr>
+        <w:pStyle w:val="u3"/>
+        <w:spacing w:line="360" w:lineRule="auto"/>
+        <w:rPr>
+          <w:rFonts w:ascii="Times New Roman" w:eastAsiaTheme="minorEastAsia" w:hAnsi="Times New Roman" w:cs="Times New Roman"/>
+          <w:b/>
+          <w:kern w:val="2"/>
+          <w:lang w:val="vi-VN" w:eastAsia="vi-VN"/>
+          <w14:ligatures w14:val="standardContextual"/>
+        </w:rPr>
+      </w:pPr>
+      <w:hyperlink w:anchor="_Toc242195422" w:history="1">
+        <w:r>
+          <w:rPr>
+            <w:rStyle w:val="Siuktni"/>
+            <w:rFonts w:ascii="Times New Roman" w:hAnsi="Times New Roman"/>
+            <w:iCs/>
+            <w:color w:val="auto"/>
+            <w:szCs w:val="26"/>
+            <w:u w:val="none"/>
+            <w:lang w:val="vi-VN"/>
+          </w:rPr>
+          <w:t>2</w:t>
+        </w:r>
+        <w:r>
+          <w:rPr>
+            <w:rStyle w:val="Siuktni"/>
+            <w:rFonts w:ascii="Times New Roman" w:hAnsi="Times New Roman" w:cs="Times New Roman"/>
+            <w:iCs/>
+            <w:color w:val="auto"/>
+            <w:sz w:val="26"/>
+            <w:szCs w:val="26"/>
+            <w:u w:val="none"/>
+            <w:lang w:val="vi-VN"/>
+          </w:rPr>
+          <w:t>.3.6 Biểu đồ triển khai</w:t>
+        </w:r>
+      </w:hyperlink>
+    </w:p>
+    <w:p>
+      <w:pPr>
+        <w:pStyle w:val="u3"/>
+        <w:spacing w:line="360" w:lineRule="auto"/>
+        <w:rPr>
+          <w:rFonts w:ascii="Times New Roman" w:eastAsiaTheme="minorEastAsia" w:hAnsi="Times New Roman" w:cs="Times New Roman"/>
+          <w:b/>
+          <w:kern w:val="2"/>
+          <w:lang w:val="vi-VN" w:eastAsia="vi-VN"/>
+          <w14:ligatures w14:val="standardContextual"/>
+        </w:rPr>
+      </w:pPr>
+      <w:hyperlink w:anchor="_Toc242195423" w:history="1">
+        <w:r>
+          <w:rPr>
+            <w:rStyle w:val="Siuktni"/>
+            <w:rFonts w:ascii="Times New Roman" w:hAnsi="Times New Roman"/>
+            <w:iCs/>
+            <w:color w:val="auto"/>
+            <w:szCs w:val="26"/>
+            <w:u w:val="none"/>
+            <w:lang w:val="vi-VN"/>
+          </w:rPr>
+          <w:t>2</w:t>
+        </w:r>
+        <w:r>
+          <w:rPr>
+            <w:rStyle w:val="Siuktni"/>
+            <w:rFonts w:ascii="Times New Roman" w:hAnsi="Times New Roman" w:cs="Times New Roman"/>
+            <w:iCs/>
+            <w:color w:val="auto"/>
+            <w:sz w:val="26"/>
+            <w:szCs w:val="26"/>
+            <w:u w:val="none"/>
+            <w:lang w:val="vi-VN"/>
+          </w:rPr>
+          <w:t>.3.7 Biểu đồ quan hệ thực thể</w:t>
+        </w:r>
+      </w:hyperlink>
+    </w:p>
+    <w:p>
+      <w:pPr>
+        <w:pStyle w:val="u3"/>
+        <w:spacing w:line="360" w:lineRule="auto"/>
+        <w:rPr>
+          <w:rFonts w:ascii="Times New Roman" w:eastAsiaTheme="minorEastAsia" w:hAnsi="Times New Roman" w:cs="Times New Roman"/>
+          <w:b/>
+          <w:kern w:val="2"/>
+          <w:lang w:val="vi-VN" w:eastAsia="vi-VN"/>
+          <w14:ligatures w14:val="standardContextual"/>
+        </w:rPr>
+      </w:pPr>
+      <w:hyperlink w:anchor="_Toc242195424" w:history="1">
+        <w:r>
+          <w:rPr>
+            <w:rStyle w:val="Siuktni"/>
+            <w:rFonts w:ascii="Times New Roman" w:hAnsi="Times New Roman"/>
+            <w:iCs/>
+            <w:color w:val="auto"/>
+            <w:szCs w:val="26"/>
+            <w:u w:val="none"/>
+            <w:lang w:val="vi-VN"/>
+          </w:rPr>
+          <w:t>2</w:t>
+        </w:r>
+        <w:r>
+          <w:rPr>
+            <w:rStyle w:val="Siuktni"/>
+            <w:rFonts w:ascii="Times New Roman" w:hAnsi="Times New Roman" w:cs="Times New Roman"/>
+            <w:iCs/>
+            <w:color w:val="auto"/>
+            <w:sz w:val="26"/>
+            <w:szCs w:val="26"/>
+            <w:u w:val="none"/>
+            <w:lang w:val="vi-VN"/>
+          </w:rPr>
+          <w:t>.3.8 Thiết kế cơ sở dữ</w:t>
+        </w:r>
+      </w:hyperlink>
+    </w:p>
+    <w:p>
+      <w:pPr>
+        <w:pStyle w:val="u3"/>
+        <w:spacing w:line="360" w:lineRule="auto"/>
+        <w:rPr>
+          <w:rFonts w:ascii="Times New Roman" w:eastAsiaTheme="minorEastAsia" w:hAnsi="Times New Roman" w:cs="Times New Roman"/>
+          <w:b/>
+          <w:kern w:val="2"/>
+          <w:lang w:val="vi-VN" w:eastAsia="vi-VN"/>
+          <w14:ligatures w14:val="standardContextual"/>
+        </w:rPr>
+      </w:pPr>
+      <w:hyperlink w:anchor="_Toc242195425" w:history="1">
+        <w:r>
+          <w:rPr>
+            <w:rStyle w:val="Siuktni"/>
+            <w:rFonts w:ascii="Times New Roman" w:hAnsi="Times New Roman"/>
+            <w:iCs/>
+            <w:color w:val="auto"/>
+            <w:szCs w:val="26"/>
+            <w:u w:val="none"/>
+            <w:lang w:val="vi-VN"/>
+          </w:rPr>
+          <w:t>2</w:t>
+        </w:r>
+        <w:r>
+          <w:rPr>
+            <w:rStyle w:val="Siuktni"/>
+            <w:rFonts w:ascii="Times New Roman" w:hAnsi="Times New Roman" w:cs="Times New Roman"/>
+            <w:iCs/>
+            <w:color w:val="auto"/>
+            <w:sz w:val="26"/>
+            <w:szCs w:val="26"/>
+            <w:u w:val="none"/>
+            <w:lang w:val="vi-VN"/>
+          </w:rPr>
+          <w:t>.3.</w:t>
+        </w:r>
+        <w:r>
+          <w:rPr>
+            <w:rStyle w:val="Siuktni"/>
+            <w:rFonts w:ascii="Times New Roman" w:hAnsi="Times New Roman"/>
+            <w:iCs/>
+            <w:color w:val="auto"/>
+            <w:szCs w:val="26"/>
+            <w:u w:val="none"/>
+            <w:lang w:val="vi-VN"/>
+          </w:rPr>
+          <w:t>9</w:t>
+        </w:r>
+        <w:r>
+          <w:rPr>
+            <w:rStyle w:val="Siuktni"/>
+            <w:rFonts w:ascii="Times New Roman" w:hAnsi="Times New Roman" w:cs="Times New Roman"/>
+            <w:iCs/>
+            <w:color w:val="auto"/>
+            <w:sz w:val="26"/>
+            <w:szCs w:val="26"/>
+            <w:u w:val="none"/>
+            <w:lang w:val="vi-VN"/>
+          </w:rPr>
+          <w:t xml:space="preserve"> Thiết kế giao diện</w:t>
+        </w:r>
+      </w:hyperlink>
+    </w:p>
+    <w:p>
+      <w:pPr>
+        <w:pStyle w:val="u3"/>
         <w:rPr>
           <w:rFonts w:ascii="Times New Roman" w:hAnsi="Times New Roman"/>
           <w:b/>
@@ -26469,7 +27363,7 @@
   <w:abstractNum w:abstractNumId="0" w15:restartNumberingAfterBreak="0">
     <w:nsid w:val="008102AD"/>
     <w:multiLevelType w:val="multilevel"/>
-    <w:tmpl w:val="D214CDB6"/>
+    <w:tmpl w:val="0CFEBCA2"/>
     <w:lvl w:ilvl="0">
       <w:start w:val="1"/>
       <w:numFmt w:val="bullet"/>
@@ -26483,7 +27377,8 @@
       </w:pPr>
       <w:rPr>
         <w:rFonts w:ascii="Symbol" w:hAnsi="Symbol" w:hint="default"/>
-        <w:sz w:val="20"/>
+        <w:sz w:val="26"/>
+        <w:szCs w:val="26"/>
       </w:rPr>
     </w:lvl>
     <w:lvl w:ilvl="1" w:tentative="1">
@@ -26618,7 +27513,7 @@
   <w:abstractNum w:abstractNumId="1" w15:restartNumberingAfterBreak="0">
     <w:nsid w:val="09BC2180"/>
     <w:multiLevelType w:val="multilevel"/>
-    <w:tmpl w:val="E8325654"/>
+    <w:tmpl w:val="30F8F19C"/>
     <w:lvl w:ilvl="0">
       <w:start w:val="1"/>
       <w:numFmt w:val="bullet"/>
@@ -26632,7 +27527,8 @@
       </w:pPr>
       <w:rPr>
         <w:rFonts w:ascii="Symbol" w:hAnsi="Symbol" w:hint="default"/>
-        <w:sz w:val="20"/>
+        <w:sz w:val="26"/>
+        <w:szCs w:val="26"/>
       </w:rPr>
     </w:lvl>
     <w:lvl w:ilvl="1" w:tentative="1">
@@ -26767,7 +27663,7 @@
   <w:abstractNum w:abstractNumId="2" w15:restartNumberingAfterBreak="0">
     <w:nsid w:val="0BEF02E5"/>
     <w:multiLevelType w:val="multilevel"/>
-    <w:tmpl w:val="7DC0B05C"/>
+    <w:tmpl w:val="1B2CB612"/>
     <w:lvl w:ilvl="0">
       <w:start w:val="1"/>
       <w:numFmt w:val="bullet"/>
@@ -26781,7 +27677,8 @@
       </w:pPr>
       <w:rPr>
         <w:rFonts w:ascii="Symbol" w:hAnsi="Symbol" w:hint="default"/>
-        <w:sz w:val="20"/>
+        <w:sz w:val="26"/>
+        <w:szCs w:val="26"/>
       </w:rPr>
     </w:lvl>
     <w:lvl w:ilvl="1" w:tentative="1">
@@ -26916,7 +27813,7 @@
   <w:abstractNum w:abstractNumId="3" w15:restartNumberingAfterBreak="0">
     <w:nsid w:val="101E7F55"/>
     <w:multiLevelType w:val="multilevel"/>
-    <w:tmpl w:val="75BA0128"/>
+    <w:tmpl w:val="40E4B980"/>
     <w:lvl w:ilvl="0">
       <w:start w:val="1"/>
       <w:numFmt w:val="bullet"/>
@@ -26930,7 +27827,8 @@
       </w:pPr>
       <w:rPr>
         <w:rFonts w:ascii="Symbol" w:hAnsi="Symbol" w:hint="default"/>
-        <w:sz w:val="20"/>
+        <w:sz w:val="26"/>
+        <w:szCs w:val="26"/>
       </w:rPr>
     </w:lvl>
     <w:lvl w:ilvl="1" w:tentative="1">
@@ -27214,7 +28112,7 @@
   <w:abstractNum w:abstractNumId="5" w15:restartNumberingAfterBreak="0">
     <w:nsid w:val="18D149DB"/>
     <w:multiLevelType w:val="multilevel"/>
-    <w:tmpl w:val="3BA0B294"/>
+    <w:tmpl w:val="CB4251EA"/>
     <w:lvl w:ilvl="0">
       <w:start w:val="1"/>
       <w:numFmt w:val="bullet"/>
@@ -27228,7 +28126,8 @@
       </w:pPr>
       <w:rPr>
         <w:rFonts w:ascii="Symbol" w:hAnsi="Symbol" w:hint="default"/>
-        <w:sz w:val="20"/>
+        <w:sz w:val="26"/>
+        <w:szCs w:val="26"/>
       </w:rPr>
     </w:lvl>
     <w:lvl w:ilvl="1" w:tentative="1">
@@ -27363,7 +28262,7 @@
   <w:abstractNum w:abstractNumId="6" w15:restartNumberingAfterBreak="0">
     <w:nsid w:val="18FA6903"/>
     <w:multiLevelType w:val="multilevel"/>
-    <w:tmpl w:val="DC089E36"/>
+    <w:tmpl w:val="F692D03A"/>
     <w:lvl w:ilvl="0">
       <w:start w:val="1"/>
       <w:numFmt w:val="bullet"/>
@@ -27377,7 +28276,8 @@
       </w:pPr>
       <w:rPr>
         <w:rFonts w:ascii="Symbol" w:hAnsi="Symbol" w:hint="default"/>
-        <w:sz w:val="20"/>
+        <w:sz w:val="26"/>
+        <w:szCs w:val="26"/>
       </w:rPr>
     </w:lvl>
     <w:lvl w:ilvl="1" w:tentative="1">
@@ -27792,7 +28692,7 @@
   <w:abstractNum w:abstractNumId="9" w15:restartNumberingAfterBreak="0">
     <w:nsid w:val="219C24F0"/>
     <w:multiLevelType w:val="multilevel"/>
-    <w:tmpl w:val="849E3252"/>
+    <w:tmpl w:val="13B09496"/>
     <w:lvl w:ilvl="0">
       <w:start w:val="1"/>
       <w:numFmt w:val="bullet"/>
@@ -27806,7 +28706,8 @@
       </w:pPr>
       <w:rPr>
         <w:rFonts w:ascii="Symbol" w:hAnsi="Symbol" w:hint="default"/>
-        <w:sz w:val="20"/>
+        <w:sz w:val="26"/>
+        <w:szCs w:val="26"/>
       </w:rPr>
     </w:lvl>
     <w:lvl w:ilvl="1" w:tentative="1">
@@ -27941,7 +28842,7 @@
   <w:abstractNum w:abstractNumId="10" w15:restartNumberingAfterBreak="0">
     <w:nsid w:val="26E30BD9"/>
     <w:multiLevelType w:val="multilevel"/>
-    <w:tmpl w:val="6720A2B6"/>
+    <w:tmpl w:val="C4440F5E"/>
     <w:lvl w:ilvl="0">
       <w:start w:val="1"/>
       <w:numFmt w:val="bullet"/>
@@ -27955,7 +28856,8 @@
       </w:pPr>
       <w:rPr>
         <w:rFonts w:ascii="Symbol" w:hAnsi="Symbol" w:hint="default"/>
-        <w:sz w:val="20"/>
+        <w:sz w:val="26"/>
+        <w:szCs w:val="26"/>
       </w:rPr>
     </w:lvl>
     <w:lvl w:ilvl="1" w:tentative="1">
@@ -28090,7 +28992,7 @@
   <w:abstractNum w:abstractNumId="11" w15:restartNumberingAfterBreak="0">
     <w:nsid w:val="29317C4E"/>
     <w:multiLevelType w:val="multilevel"/>
-    <w:tmpl w:val="2DDCA4FE"/>
+    <w:tmpl w:val="40CA115E"/>
     <w:lvl w:ilvl="0">
       <w:start w:val="1"/>
       <w:numFmt w:val="bullet"/>
@@ -28104,7 +29006,8 @@
       </w:pPr>
       <w:rPr>
         <w:rFonts w:ascii="Symbol" w:hAnsi="Symbol" w:hint="default"/>
-        <w:sz w:val="20"/>
+        <w:sz w:val="26"/>
+        <w:szCs w:val="26"/>
       </w:rPr>
     </w:lvl>
     <w:lvl w:ilvl="1" w:tentative="1">
@@ -28239,7 +29142,7 @@
   <w:abstractNum w:abstractNumId="12" w15:restartNumberingAfterBreak="0">
     <w:nsid w:val="390526B3"/>
     <w:multiLevelType w:val="multilevel"/>
-    <w:tmpl w:val="940E5D04"/>
+    <w:tmpl w:val="4F3C03AC"/>
     <w:lvl w:ilvl="0">
       <w:start w:val="1"/>
       <w:numFmt w:val="bullet"/>
@@ -28253,7 +29156,8 @@
       </w:pPr>
       <w:rPr>
         <w:rFonts w:ascii="Symbol" w:hAnsi="Symbol" w:hint="default"/>
-        <w:sz w:val="20"/>
+        <w:sz w:val="26"/>
+        <w:szCs w:val="26"/>
       </w:rPr>
     </w:lvl>
     <w:lvl w:ilvl="1" w:tentative="1">
@@ -28388,7 +29292,7 @@
   <w:abstractNum w:abstractNumId="13" w15:restartNumberingAfterBreak="0">
     <w:nsid w:val="3B7C43C4"/>
     <w:multiLevelType w:val="multilevel"/>
-    <w:tmpl w:val="F95E16DA"/>
+    <w:tmpl w:val="FE3E31EE"/>
     <w:lvl w:ilvl="0">
       <w:start w:val="1"/>
       <w:numFmt w:val="bullet"/>
@@ -28402,7 +29306,8 @@
       </w:pPr>
       <w:rPr>
         <w:rFonts w:ascii="Symbol" w:hAnsi="Symbol" w:hint="default"/>
-        <w:sz w:val="20"/>
+        <w:sz w:val="26"/>
+        <w:szCs w:val="26"/>
       </w:rPr>
     </w:lvl>
     <w:lvl w:ilvl="1" w:tentative="1">
@@ -28686,7 +29591,7 @@
   <w:abstractNum w:abstractNumId="15" w15:restartNumberingAfterBreak="0">
     <w:nsid w:val="427413D5"/>
     <w:multiLevelType w:val="multilevel"/>
-    <w:tmpl w:val="25F81F18"/>
+    <w:tmpl w:val="57A6D682"/>
     <w:lvl w:ilvl="0">
       <w:start w:val="1"/>
       <w:numFmt w:val="bullet"/>
@@ -28700,7 +29605,8 @@
       </w:pPr>
       <w:rPr>
         <w:rFonts w:ascii="Symbol" w:hAnsi="Symbol" w:hint="default"/>
-        <w:sz w:val="20"/>
+        <w:sz w:val="26"/>
+        <w:szCs w:val="26"/>
       </w:rPr>
     </w:lvl>
     <w:lvl w:ilvl="1" w:tentative="1">
@@ -29124,7 +30030,7 @@
   <w:abstractNum w:abstractNumId="18" w15:restartNumberingAfterBreak="0">
     <w:nsid w:val="641E0E91"/>
     <w:multiLevelType w:val="multilevel"/>
-    <w:tmpl w:val="E4DEAEA6"/>
+    <w:tmpl w:val="AFEEAA56"/>
     <w:lvl w:ilvl="0">
       <w:start w:val="1"/>
       <w:numFmt w:val="bullet"/>
@@ -29138,7 +30044,8 @@
       </w:pPr>
       <w:rPr>
         <w:rFonts w:ascii="Symbol" w:hAnsi="Symbol" w:hint="default"/>
-        <w:sz w:val="20"/>
+        <w:sz w:val="26"/>
+        <w:szCs w:val="26"/>
       </w:rPr>
     </w:lvl>
     <w:lvl w:ilvl="1" w:tentative="1">
@@ -29273,7 +30180,7 @@
   <w:abstractNum w:abstractNumId="19" w15:restartNumberingAfterBreak="0">
     <w:nsid w:val="67295066"/>
     <w:multiLevelType w:val="multilevel"/>
-    <w:tmpl w:val="2F345130"/>
+    <w:tmpl w:val="E44EFFEE"/>
     <w:lvl w:ilvl="0">
       <w:start w:val="1"/>
       <w:numFmt w:val="bullet"/>
@@ -29287,7 +30194,8 @@
       </w:pPr>
       <w:rPr>
         <w:rFonts w:ascii="Symbol" w:hAnsi="Symbol" w:hint="default"/>
-        <w:sz w:val="20"/>
+        <w:sz w:val="26"/>
+        <w:szCs w:val="26"/>
       </w:rPr>
     </w:lvl>
     <w:lvl w:ilvl="1" w:tentative="1">
@@ -29562,7 +30470,7 @@
   <w:abstractNum w:abstractNumId="21" w15:restartNumberingAfterBreak="0">
     <w:nsid w:val="6A714514"/>
     <w:multiLevelType w:val="multilevel"/>
-    <w:tmpl w:val="92A2B876"/>
+    <w:tmpl w:val="D0CCBCD4"/>
     <w:lvl w:ilvl="0">
       <w:start w:val="1"/>
       <w:numFmt w:val="bullet"/>
@@ -29576,7 +30484,8 @@
       </w:pPr>
       <w:rPr>
         <w:rFonts w:ascii="Symbol" w:hAnsi="Symbol" w:hint="default"/>
-        <w:sz w:val="20"/>
+        <w:sz w:val="26"/>
+        <w:szCs w:val="26"/>
       </w:rPr>
     </w:lvl>
     <w:lvl w:ilvl="1" w:tentative="1">
@@ -29711,7 +30620,7 @@
   <w:abstractNum w:abstractNumId="22" w15:restartNumberingAfterBreak="0">
     <w:nsid w:val="6FCF2A5E"/>
     <w:multiLevelType w:val="multilevel"/>
-    <w:tmpl w:val="27287B70"/>
+    <w:tmpl w:val="B8FC4CA6"/>
     <w:lvl w:ilvl="0">
       <w:start w:val="1"/>
       <w:numFmt w:val="bullet"/>
@@ -29725,7 +30634,8 @@
       </w:pPr>
       <w:rPr>
         <w:rFonts w:ascii="Symbol" w:hAnsi="Symbol" w:hint="default"/>
-        <w:sz w:val="20"/>
+        <w:sz w:val="26"/>
+        <w:szCs w:val="26"/>
       </w:rPr>
     </w:lvl>
     <w:lvl w:ilvl="1" w:tentative="1">
@@ -29860,7 +30770,7 @@
   <w:abstractNum w:abstractNumId="23" w15:restartNumberingAfterBreak="0">
     <w:nsid w:val="77B94170"/>
     <w:multiLevelType w:val="multilevel"/>
-    <w:tmpl w:val="2F8C5C2C"/>
+    <w:tmpl w:val="F2AEC0CA"/>
     <w:lvl w:ilvl="0">
       <w:start w:val="1"/>
       <w:numFmt w:val="bullet"/>
@@ -29874,7 +30784,8 @@
       </w:pPr>
       <w:rPr>
         <w:rFonts w:ascii="Symbol" w:hAnsi="Symbol" w:hint="default"/>
-        <w:sz w:val="20"/>
+        <w:sz w:val="26"/>
+        <w:szCs w:val="26"/>
       </w:rPr>
     </w:lvl>
     <w:lvl w:ilvl="1" w:tentative="1">
@@ -30185,7 +31096,7 @@
     <w:lsdException w:name="Body Text Indent 2" w:semiHidden="1" w:unhideWhenUsed="1"/>
     <w:lsdException w:name="Body Text Indent 3" w:semiHidden="1" w:unhideWhenUsed="1"/>
     <w:lsdException w:name="Block Text" w:semiHidden="1" w:unhideWhenUsed="1"/>
-    <w:lsdException w:name="Hyperlink" w:semiHidden="1" w:uiPriority="0" w:unhideWhenUsed="1"/>
+    <w:lsdException w:name="Hyperlink" w:semiHidden="1" w:unhideWhenUsed="1"/>
     <w:lsdException w:name="FollowedHyperlink" w:semiHidden="1" w:unhideWhenUsed="1"/>
     <w:lsdException w:name="Strong" w:uiPriority="22" w:qFormat="1"/>
     <w:lsdException w:name="Emphasis" w:uiPriority="0" w:qFormat="1"/>
@@ -30656,6 +31567,7 @@
   </w:style>
   <w:style w:type="character" w:styleId="Siuktni">
     <w:name w:val="Hyperlink"/>
+    <w:uiPriority w:val="99"/>
     <w:rsid w:val="00DC1354"/>
     <w:rPr>
       <w:color w:val="0000FF"/>
@@ -30756,6 +31668,69 @@
       <w:color w:val="2E74B5" w:themeColor="accent1" w:themeShade="BF"/>
       <w:sz w:val="26"/>
       <w:szCs w:val="26"/>
+    </w:rPr>
+  </w:style>
+  <w:style w:type="paragraph" w:styleId="Mucluc1">
+    <w:name w:val="toc 1"/>
+    <w:basedOn w:val="Binhthng"/>
+    <w:next w:val="Binhthng"/>
+    <w:autoRedefine/>
+    <w:uiPriority w:val="39"/>
+    <w:unhideWhenUsed/>
+    <w:rsid w:val="00ED2472"/>
+    <w:pPr>
+      <w:spacing w:before="120" w:after="120" w:line="360" w:lineRule="auto"/>
+    </w:pPr>
+    <w:rPr>
+      <w:rFonts w:ascii="Times New Roman" w:hAnsi="Times New Roman"/>
+      <w:bCs/>
+      <w:iCs/>
+      <w:noProof/>
+      <w:szCs w:val="26"/>
+    </w:rPr>
+  </w:style>
+  <w:style w:type="paragraph" w:styleId="Mucluc2">
+    <w:name w:val="toc 2"/>
+    <w:basedOn w:val="Binhthng"/>
+    <w:next w:val="Binhthng"/>
+    <w:autoRedefine/>
+    <w:uiPriority w:val="39"/>
+    <w:unhideWhenUsed/>
+    <w:rsid w:val="00ED2472"/>
+    <w:pPr>
+      <w:tabs>
+        <w:tab w:val="right" w:leader="dot" w:pos="9345"/>
+      </w:tabs>
+      <w:spacing w:before="120" w:line="360" w:lineRule="auto"/>
+    </w:pPr>
+    <w:rPr>
+      <w:rFonts w:ascii="Times New Roman" w:hAnsi="Times New Roman" w:cs="Calibri"/>
+      <w:bCs/>
+      <w:noProof/>
+      <w:szCs w:val="22"/>
+    </w:rPr>
+  </w:style>
+  <w:style w:type="paragraph" w:styleId="Mucluc3">
+    <w:name w:val="toc 3"/>
+    <w:basedOn w:val="Binhthng"/>
+    <w:next w:val="Binhthng"/>
+    <w:autoRedefine/>
+    <w:uiPriority w:val="39"/>
+    <w:unhideWhenUsed/>
+    <w:rsid w:val="00ED2472"/>
+    <w:pPr>
+      <w:tabs>
+        <w:tab w:val="right" w:leader="dot" w:pos="9345"/>
+      </w:tabs>
+      <w:spacing w:after="100"/>
+      <w:ind w:left="480"/>
+    </w:pPr>
+    <w:rPr>
+      <w:rFonts w:ascii="Times New Roman" w:hAnsi="Times New Roman"/>
+      <w:b/>
+      <w:bCs/>
+      <w:noProof/>
+      <w:sz w:val="24"/>
     </w:rPr>
   </w:style>
 </w:styles>

</xml_diff>